<commit_message>
fix: Replace broken 01_Mau_Bao_cao_PGD.docx template with the valid one containing tags
</commit_message>
<xml_diff>
--- a/webapp/templates/TOTRINH/01_Mau_Bao_cao_PGD.docx
+++ b/webapp/templates/TOTRINH/01_Mau_Bao_cao_PGD.docx
@@ -616,52 +616,8 @@
           <w:rFonts w:ascii="Times New Roman" w:hAnsi="Times New Roman"/>
         </w:rPr>
       </w:pPr>
-      <w:proofErr w:type="spellStart"/>
       <w:r>
-        <w:rPr>
-          <w:rFonts w:ascii="Times New Roman" w:hAnsi="Times New Roman"/>
-        </w:rPr>
-        <w:t>V</w:t>
-      </w:r>
-      <w:r>
-        <w:rPr>
-          <w:rFonts w:ascii="Times New Roman" w:hAnsi="Times New Roman"/>
-        </w:rPr>
-        <w:t>ề</w:t>
-      </w:r>
-      <w:proofErr w:type="spellEnd"/>
-      <w:r>
-        <w:rPr>
-          <w:rFonts w:ascii="Times New Roman" w:hAnsi="Times New Roman"/>
-        </w:rPr>
-        <w:t xml:space="preserve"> </w:t>
-      </w:r>
-      <w:proofErr w:type="spellStart"/>
-      <w:r>
-        <w:rPr>
-          <w:rFonts w:ascii="Times New Roman" w:hAnsi="Times New Roman"/>
-        </w:rPr>
-        <w:t>việc</w:t>
-      </w:r>
-      <w:proofErr w:type="spellEnd"/>
-      <w:r>
-        <w:rPr>
-          <w:rFonts w:ascii="Times New Roman" w:hAnsi="Times New Roman"/>
-        </w:rPr>
-        <w:t xml:space="preserve">............................... </w:t>
-      </w:r>
-      <w:r>
-        <w:rPr>
-          <w:rFonts w:ascii="Times New Roman" w:hAnsi="Times New Roman"/>
-          <w:sz w:val="24"/>
-        </w:rPr>
-        <w:t xml:space="preserve"> </w:t>
-      </w:r>
-      <w:r>
-        <w:rPr>
-          <w:rFonts w:ascii="Times New Roman" w:hAnsi="Times New Roman"/>
-        </w:rPr>
-        <w:t>.............................</w:t>
+        <w:t>Về việc (TITLE)</w:t>
       </w:r>
     </w:p>
     <w:p>
@@ -788,7 +744,34 @@
           <w:rFonts w:ascii="Times New Roman" w:hAnsi="Times New Roman"/>
         </w:rPr>
         <w:tab/>
-        <w:t>..............................................................................................................................................................................................................................................................................................................................................................</w:t>
+        <w:t>................................................</w:t>
+      </w:r>
+      <w:r>
+        <w:rPr>
+          <w:rFonts w:ascii="Times New Roman" w:hAnsi="Times New Roman"/>
+          <w:sz w:val="24"/>
+        </w:rPr>
+        <w:t>(</w:t>
+      </w:r>
+      <w:r>
+        <w:rPr>
+          <w:rFonts w:ascii="Times New Roman" w:hAnsi="Times New Roman"/>
+          <w:sz w:val="24"/>
+        </w:rPr>
+        <w:t>4</w:t>
+      </w:r>
+      <w:r>
+        <w:rPr>
+          <w:rFonts w:ascii="Times New Roman" w:hAnsi="Times New Roman"/>
+          <w:sz w:val="24"/>
+        </w:rPr>
+        <w:t>)</w:t>
+      </w:r>
+      <w:r>
+        <w:rPr>
+          <w:rFonts w:ascii="Times New Roman" w:hAnsi="Times New Roman"/>
+        </w:rPr>
+        <w:t>..............................................................................................................................................................................................................................................................................................................</w:t>
       </w:r>
       <w:r>
         <w:rPr>
@@ -978,15 +961,7 @@
                 <w:rFonts w:ascii="Times New Roman" w:hAnsi="Times New Roman"/>
                 <w:sz w:val="22"/>
               </w:rPr>
-              <w:t xml:space="preserve">u: VT, </w:t>
-            </w:r>
-            <w:proofErr w:type="gramStart"/>
-            <w:r>
-              <w:rPr>
-                <w:rFonts w:ascii="Times New Roman" w:hAnsi="Times New Roman"/>
-                <w:sz w:val="22"/>
-              </w:rPr>
-              <w:t>...</w:t>
+              <w:t>u: VT, ...</w:t>
             </w:r>
             <w:r>
               <w:rPr>
@@ -995,7 +970,6 @@
               </w:rPr>
               <w:t>(</w:t>
             </w:r>
-            <w:proofErr w:type="gramEnd"/>
             <w:r>
               <w:rPr>
                 <w:rFonts w:ascii="Times New Roman" w:hAnsi="Times New Roman"/>
@@ -1024,7 +998,6 @@
               </w:rPr>
               <w:t xml:space="preserve"> </w:t>
             </w:r>
-            <w:proofErr w:type="gramStart"/>
             <w:r>
               <w:rPr>
                 <w:rFonts w:ascii="Times New Roman" w:hAnsi="Times New Roman"/>
@@ -1039,7 +1012,6 @@
               </w:rPr>
               <w:t>(</w:t>
             </w:r>
-            <w:proofErr w:type="gramEnd"/>
             <w:r>
               <w:rPr>
                 <w:rFonts w:ascii="Times New Roman" w:hAnsi="Times New Roman"/>
@@ -1100,7 +1072,6 @@
               <w:t xml:space="preserve"> </w:t>
             </w:r>
             <w:proofErr w:type="spellStart"/>
-            <w:proofErr w:type="gramStart"/>
             <w:r>
               <w:rPr>
                 <w:rFonts w:ascii="Times New Roman" w:hAnsi="Times New Roman"/>
@@ -1118,9 +1089,8 @@
                 <w:bCs/>
                 <w:sz w:val="24"/>
               </w:rPr>
-              <w:t>: ..</w:t>
-            </w:r>
-            <w:proofErr w:type="gramEnd"/>
+              <w:t>: ..(</w:t>
+            </w:r>
             <w:r>
               <w:rPr>
                 <w:rFonts w:ascii="Times New Roman" w:hAnsi="Times New Roman"/>
@@ -1128,7 +1098,7 @@
                 <w:bCs/>
                 <w:sz w:val="24"/>
               </w:rPr>
-              <w:t>(</w:t>
+              <w:t>8</w:t>
             </w:r>
             <w:r>
               <w:rPr>
@@ -1137,27 +1107,7 @@
                 <w:bCs/>
                 <w:sz w:val="24"/>
               </w:rPr>
-              <w:t>8</w:t>
-            </w:r>
-            <w:proofErr w:type="gramStart"/>
-            <w:r>
-              <w:rPr>
-                <w:rFonts w:ascii="Times New Roman" w:hAnsi="Times New Roman"/>
-                <w:b/>
-                <w:bCs/>
-                <w:sz w:val="24"/>
-              </w:rPr>
-              <w:t>)..</w:t>
-            </w:r>
-            <w:proofErr w:type="gramEnd"/>
-            <w:r>
-              <w:rPr>
-                <w:rFonts w:ascii="Times New Roman" w:hAnsi="Times New Roman"/>
-                <w:b/>
-                <w:bCs/>
-                <w:sz w:val="24"/>
-              </w:rPr>
-              <w:t>-</w:t>
+              <w:t>)..-</w:t>
             </w:r>
             <w:r>
               <w:rPr>
@@ -1203,11 +1153,19 @@
               <w:jc w:val="center"/>
               <w:rPr>
                 <w:rFonts w:ascii="Times New Roman" w:hAnsi="Times New Roman"/>
+                <w:bCs/>
+                <w:lang w:val="vi-VN"/>
+              </w:rPr>
+            </w:pPr>
+            <w:r>
+              <w:rPr>
+                <w:rFonts w:ascii="Times New Roman" w:hAnsi="Times New Roman"/>
                 <w:b/>
                 <w:bCs/>
                 <w:spacing w:val="-6"/>
               </w:rPr>
-            </w:pPr>
+              <w:t>GIÁM ĐỐC</w:t>
+            </w:r>
             <w:r>
               <w:rPr>
                 <w:rFonts w:ascii="Times New Roman" w:hAnsi="Times New Roman"/>
@@ -1215,45 +1173,7 @@
                 <w:bCs/>
                 <w:spacing w:val="-6"/>
               </w:rPr>
-              <w:t xml:space="preserve">KT. </w:t>
-            </w:r>
-            <w:r>
-              <w:rPr>
-                <w:rFonts w:ascii="Times New Roman" w:hAnsi="Times New Roman"/>
-                <w:b/>
-                <w:bCs/>
-                <w:spacing w:val="-6"/>
-              </w:rPr>
-              <w:t>GIÁM ĐỐC</w:t>
-            </w:r>
-            <w:r>
-              <w:rPr>
-                <w:rFonts w:ascii="Times New Roman" w:hAnsi="Times New Roman"/>
-                <w:b/>
-                <w:bCs/>
-                <w:spacing w:val="-6"/>
-              </w:rPr>
-              <w:t xml:space="preserve"> </w:t>
-            </w:r>
-          </w:p>
-          <w:p>
-            <w:pPr>
-              <w:ind w:right="-1"/>
-              <w:jc w:val="center"/>
-              <w:rPr>
-                <w:rFonts w:ascii="Times New Roman" w:hAnsi="Times New Roman"/>
-                <w:bCs/>
-                <w:lang w:val="vi-VN"/>
-              </w:rPr>
-            </w:pPr>
-            <w:r>
-              <w:rPr>
-                <w:rFonts w:ascii="Times New Roman" w:hAnsi="Times New Roman"/>
-                <w:b/>
-                <w:bCs/>
-                <w:spacing w:val="-6"/>
-              </w:rPr>
-              <w:t xml:space="preserve">PHÓ GIÁM ĐỐC </w:t>
+              <w:t xml:space="preserve"> </w:t>
             </w:r>
           </w:p>
           <w:p>
@@ -1284,6 +1204,68 @@
                 <w:bCs/>
               </w:rPr>
             </w:pPr>
+            <w:r>
+              <w:rPr>
+                <w:rFonts w:ascii="Times New Roman" w:hAnsi="Times New Roman"/>
+                <w:bCs/>
+                <w:i/>
+              </w:rPr>
+              <w:t>(</w:t>
+            </w:r>
+            <w:proofErr w:type="spellStart"/>
+            <w:r>
+              <w:rPr>
+                <w:rFonts w:ascii="Times New Roman" w:hAnsi="Times New Roman"/>
+                <w:bCs/>
+                <w:i/>
+              </w:rPr>
+              <w:t>chữ</w:t>
+            </w:r>
+            <w:proofErr w:type="spellEnd"/>
+            <w:r>
+              <w:rPr>
+                <w:rFonts w:ascii="Times New Roman" w:hAnsi="Times New Roman"/>
+                <w:bCs/>
+                <w:i/>
+              </w:rPr>
+              <w:t xml:space="preserve"> </w:t>
+            </w:r>
+            <w:proofErr w:type="spellStart"/>
+            <w:r>
+              <w:rPr>
+                <w:rFonts w:ascii="Times New Roman" w:hAnsi="Times New Roman"/>
+                <w:bCs/>
+                <w:i/>
+              </w:rPr>
+              <w:t>ký</w:t>
+            </w:r>
+            <w:proofErr w:type="spellEnd"/>
+            <w:r>
+              <w:rPr>
+                <w:rFonts w:ascii="Times New Roman" w:hAnsi="Times New Roman"/>
+                <w:bCs/>
+                <w:i/>
+              </w:rPr>
+              <w:t xml:space="preserve">, </w:t>
+            </w:r>
+            <w:proofErr w:type="spellStart"/>
+            <w:r>
+              <w:rPr>
+                <w:rFonts w:ascii="Times New Roman" w:hAnsi="Times New Roman"/>
+                <w:bCs/>
+                <w:i/>
+              </w:rPr>
+              <w:t>dấu</w:t>
+            </w:r>
+            <w:proofErr w:type="spellEnd"/>
+            <w:r>
+              <w:rPr>
+                <w:rFonts w:ascii="Times New Roman" w:hAnsi="Times New Roman"/>
+                <w:bCs/>
+                <w:i/>
+              </w:rPr>
+              <w:t>)</w:t>
+            </w:r>
           </w:p>
           <w:p>
             <w:pPr>
@@ -1326,6 +1308,3974 @@
             </w:pPr>
             <w:r>
               <w:t>(SIGNER)</w:t>
+            </w:r>
+          </w:p>
+        </w:tc>
+      </w:tr>
+    </w:tbl>
+    <w:p>
+      <w:pPr>
+        <w:pStyle w:val="FootnoteText"/>
+        <w:rPr>
+          <w:sz w:val="24"/>
+        </w:rPr>
+      </w:pPr>
+    </w:p>
+    <w:tbl>
+      <w:tblPr>
+        <w:tblpPr w:leftFromText="180" w:rightFromText="180" w:vertAnchor="text" w:horzAnchor="margin" w:tblpY="12"/>
+        <w:tblW w:w="9322" w:type="dxa"/>
+        <w:tblBorders>
+          <w:top w:val="single" w:sz="8" w:space="0" w:color="auto"/>
+        </w:tblBorders>
+        <w:tblLayout w:type="fixed"/>
+        <w:tblLook w:val="0000" w:firstRow="0" w:lastRow="0" w:firstColumn="0" w:lastColumn="0" w:noHBand="0" w:noVBand="0"/>
+      </w:tblPr>
+      <w:tblGrid>
+        <w:gridCol w:w="9322"/>
+      </w:tblGrid>
+      <w:tr>
+        <w:tc>
+          <w:tcPr>
+            <w:tcW w:w="9322" w:type="dxa"/>
+          </w:tcPr>
+          <w:p>
+            <w:pPr>
+              <w:pStyle w:val="FootnoteText"/>
+              <w:jc w:val="both"/>
+              <w:rPr>
+                <w:b/>
+                <w:i/>
+                <w:sz w:val="22"/>
+                <w:szCs w:val="22"/>
+              </w:rPr>
+            </w:pPr>
+            <w:proofErr w:type="spellStart"/>
+            <w:r>
+              <w:rPr>
+                <w:b/>
+                <w:i/>
+                <w:sz w:val="22"/>
+                <w:szCs w:val="22"/>
+              </w:rPr>
+              <w:t>Ghi</w:t>
+            </w:r>
+            <w:proofErr w:type="spellEnd"/>
+            <w:r>
+              <w:rPr>
+                <w:b/>
+                <w:i/>
+                <w:sz w:val="22"/>
+                <w:szCs w:val="22"/>
+              </w:rPr>
+              <w:t xml:space="preserve"> </w:t>
+            </w:r>
+            <w:proofErr w:type="spellStart"/>
+            <w:r>
+              <w:rPr>
+                <w:b/>
+                <w:i/>
+                <w:sz w:val="22"/>
+                <w:szCs w:val="22"/>
+              </w:rPr>
+              <w:t>chú</w:t>
+            </w:r>
+            <w:proofErr w:type="spellEnd"/>
+            <w:r>
+              <w:rPr>
+                <w:b/>
+                <w:i/>
+                <w:sz w:val="22"/>
+                <w:szCs w:val="22"/>
+              </w:rPr>
+              <w:t>:</w:t>
+            </w:r>
+            <w:r>
+              <w:rPr>
+                <w:b/>
+                <w:i/>
+                <w:sz w:val="22"/>
+                <w:szCs w:val="22"/>
+              </w:rPr>
+              <w:t xml:space="preserve"> </w:t>
+            </w:r>
+            <w:r>
+              <w:rPr>
+                <w:b/>
+                <w:bCs/>
+                <w:i/>
+                <w:iCs/>
+                <w:sz w:val="22"/>
+                <w:szCs w:val="22"/>
+                <w:lang w:eastAsia="zh-CN"/>
+              </w:rPr>
+              <w:t xml:space="preserve"> Các </w:t>
+            </w:r>
+            <w:proofErr w:type="spellStart"/>
+            <w:r>
+              <w:rPr>
+                <w:b/>
+                <w:bCs/>
+                <w:i/>
+                <w:iCs/>
+                <w:sz w:val="22"/>
+                <w:szCs w:val="22"/>
+                <w:lang w:eastAsia="zh-CN"/>
+              </w:rPr>
+              <w:t>phần</w:t>
+            </w:r>
+            <w:proofErr w:type="spellEnd"/>
+            <w:r>
+              <w:rPr>
+                <w:b/>
+                <w:bCs/>
+                <w:i/>
+                <w:iCs/>
+                <w:sz w:val="22"/>
+                <w:szCs w:val="22"/>
+                <w:lang w:eastAsia="zh-CN"/>
+              </w:rPr>
+              <w:t xml:space="preserve"> </w:t>
+            </w:r>
+            <w:proofErr w:type="spellStart"/>
+            <w:r>
+              <w:rPr>
+                <w:b/>
+                <w:bCs/>
+                <w:i/>
+                <w:iCs/>
+                <w:sz w:val="22"/>
+                <w:szCs w:val="22"/>
+                <w:lang w:eastAsia="zh-CN"/>
+              </w:rPr>
+              <w:t>ghi</w:t>
+            </w:r>
+            <w:proofErr w:type="spellEnd"/>
+            <w:r>
+              <w:rPr>
+                <w:b/>
+                <w:bCs/>
+                <w:i/>
+                <w:iCs/>
+                <w:sz w:val="22"/>
+                <w:szCs w:val="22"/>
+                <w:lang w:eastAsia="zh-CN"/>
+              </w:rPr>
+              <w:t xml:space="preserve">: </w:t>
+            </w:r>
+            <w:proofErr w:type="spellStart"/>
+            <w:r>
+              <w:rPr>
+                <w:b/>
+                <w:bCs/>
+                <w:i/>
+                <w:iCs/>
+                <w:sz w:val="22"/>
+                <w:szCs w:val="22"/>
+                <w:lang w:eastAsia="zh-CN"/>
+              </w:rPr>
+              <w:t>số</w:t>
+            </w:r>
+            <w:proofErr w:type="spellEnd"/>
+            <w:r>
+              <w:rPr>
+                <w:b/>
+                <w:bCs/>
+                <w:i/>
+                <w:iCs/>
+                <w:sz w:val="22"/>
+                <w:szCs w:val="22"/>
+                <w:lang w:eastAsia="zh-CN"/>
+              </w:rPr>
+              <w:t xml:space="preserve">: </w:t>
+            </w:r>
+            <w:proofErr w:type="spellStart"/>
+            <w:r>
+              <w:rPr>
+                <w:b/>
+                <w:bCs/>
+                <w:i/>
+                <w:iCs/>
+                <w:sz w:val="22"/>
+                <w:szCs w:val="22"/>
+                <w:lang w:eastAsia="zh-CN"/>
+              </w:rPr>
+              <w:t>ký</w:t>
+            </w:r>
+            <w:proofErr w:type="spellEnd"/>
+            <w:r>
+              <w:rPr>
+                <w:b/>
+                <w:bCs/>
+                <w:i/>
+                <w:iCs/>
+                <w:sz w:val="22"/>
+                <w:szCs w:val="22"/>
+                <w:lang w:eastAsia="zh-CN"/>
+              </w:rPr>
+              <w:t xml:space="preserve"> </w:t>
+            </w:r>
+            <w:proofErr w:type="spellStart"/>
+            <w:r>
+              <w:rPr>
+                <w:b/>
+                <w:bCs/>
+                <w:i/>
+                <w:iCs/>
+                <w:sz w:val="22"/>
+                <w:szCs w:val="22"/>
+                <w:lang w:eastAsia="zh-CN"/>
+              </w:rPr>
+              <w:t>hiệu</w:t>
+            </w:r>
+            <w:proofErr w:type="spellEnd"/>
+            <w:r>
+              <w:rPr>
+                <w:b/>
+                <w:bCs/>
+                <w:i/>
+                <w:iCs/>
+                <w:sz w:val="22"/>
+                <w:szCs w:val="22"/>
+                <w:lang w:eastAsia="zh-CN"/>
+              </w:rPr>
+              <w:t xml:space="preserve">, </w:t>
+            </w:r>
+            <w:proofErr w:type="spellStart"/>
+            <w:r>
+              <w:rPr>
+                <w:b/>
+                <w:bCs/>
+                <w:i/>
+                <w:iCs/>
+                <w:sz w:val="22"/>
+                <w:szCs w:val="22"/>
+                <w:lang w:eastAsia="zh-CN"/>
+              </w:rPr>
+              <w:t>ngày</w:t>
+            </w:r>
+            <w:proofErr w:type="spellEnd"/>
+            <w:r>
+              <w:rPr>
+                <w:b/>
+                <w:bCs/>
+                <w:i/>
+                <w:iCs/>
+                <w:sz w:val="22"/>
+                <w:szCs w:val="22"/>
+                <w:lang w:eastAsia="zh-CN"/>
+              </w:rPr>
+              <w:t xml:space="preserve">, </w:t>
+            </w:r>
+            <w:proofErr w:type="spellStart"/>
+            <w:r>
+              <w:rPr>
+                <w:b/>
+                <w:bCs/>
+                <w:i/>
+                <w:iCs/>
+                <w:sz w:val="22"/>
+                <w:szCs w:val="22"/>
+                <w:lang w:eastAsia="zh-CN"/>
+              </w:rPr>
+              <w:t>tháng</w:t>
+            </w:r>
+            <w:proofErr w:type="spellEnd"/>
+            <w:r>
+              <w:rPr>
+                <w:b/>
+                <w:bCs/>
+                <w:i/>
+                <w:iCs/>
+                <w:sz w:val="22"/>
+                <w:szCs w:val="22"/>
+                <w:lang w:eastAsia="zh-CN"/>
+              </w:rPr>
+              <w:t xml:space="preserve">, </w:t>
+            </w:r>
+            <w:proofErr w:type="spellStart"/>
+            <w:r>
+              <w:rPr>
+                <w:b/>
+                <w:bCs/>
+                <w:i/>
+                <w:iCs/>
+                <w:sz w:val="22"/>
+                <w:szCs w:val="22"/>
+                <w:lang w:eastAsia="zh-CN"/>
+              </w:rPr>
+              <w:t>năm</w:t>
+            </w:r>
+            <w:proofErr w:type="spellEnd"/>
+            <w:r>
+              <w:rPr>
+                <w:b/>
+                <w:bCs/>
+                <w:i/>
+                <w:iCs/>
+                <w:sz w:val="22"/>
+                <w:szCs w:val="22"/>
+                <w:lang w:eastAsia="zh-CN"/>
+              </w:rPr>
+              <w:t xml:space="preserve"> </w:t>
+            </w:r>
+            <w:proofErr w:type="spellStart"/>
+            <w:r>
+              <w:rPr>
+                <w:b/>
+                <w:bCs/>
+                <w:i/>
+                <w:iCs/>
+                <w:sz w:val="22"/>
+                <w:szCs w:val="22"/>
+                <w:lang w:eastAsia="zh-CN"/>
+              </w:rPr>
+              <w:t>của</w:t>
+            </w:r>
+            <w:proofErr w:type="spellEnd"/>
+            <w:r>
+              <w:rPr>
+                <w:b/>
+                <w:bCs/>
+                <w:i/>
+                <w:iCs/>
+                <w:sz w:val="22"/>
+                <w:szCs w:val="22"/>
+                <w:lang w:eastAsia="zh-CN"/>
+              </w:rPr>
+              <w:t xml:space="preserve"> </w:t>
+            </w:r>
+            <w:proofErr w:type="spellStart"/>
+            <w:r>
+              <w:rPr>
+                <w:b/>
+                <w:bCs/>
+                <w:i/>
+                <w:iCs/>
+                <w:sz w:val="22"/>
+                <w:szCs w:val="22"/>
+                <w:lang w:eastAsia="zh-CN"/>
+              </w:rPr>
+              <w:t>văn</w:t>
+            </w:r>
+            <w:proofErr w:type="spellEnd"/>
+            <w:r>
+              <w:rPr>
+                <w:b/>
+                <w:bCs/>
+                <w:i/>
+                <w:iCs/>
+                <w:sz w:val="22"/>
+                <w:szCs w:val="22"/>
+                <w:lang w:eastAsia="zh-CN"/>
+              </w:rPr>
+              <w:t xml:space="preserve"> </w:t>
+            </w:r>
+            <w:proofErr w:type="spellStart"/>
+            <w:r>
+              <w:rPr>
+                <w:b/>
+                <w:bCs/>
+                <w:i/>
+                <w:iCs/>
+                <w:sz w:val="22"/>
+                <w:szCs w:val="22"/>
+                <w:lang w:eastAsia="zh-CN"/>
+              </w:rPr>
+              <w:t>bản</w:t>
+            </w:r>
+            <w:proofErr w:type="spellEnd"/>
+            <w:r>
+              <w:rPr>
+                <w:b/>
+                <w:bCs/>
+                <w:i/>
+                <w:iCs/>
+                <w:sz w:val="22"/>
+                <w:szCs w:val="22"/>
+                <w:lang w:eastAsia="zh-CN"/>
+              </w:rPr>
+              <w:t xml:space="preserve"> (</w:t>
+            </w:r>
+            <w:proofErr w:type="spellStart"/>
+            <w:r>
+              <w:rPr>
+                <w:b/>
+                <w:bCs/>
+                <w:i/>
+                <w:iCs/>
+                <w:sz w:val="22"/>
+                <w:szCs w:val="22"/>
+                <w:lang w:eastAsia="zh-CN"/>
+              </w:rPr>
+              <w:t>để</w:t>
+            </w:r>
+            <w:proofErr w:type="spellEnd"/>
+            <w:r>
+              <w:rPr>
+                <w:b/>
+                <w:bCs/>
+                <w:i/>
+                <w:iCs/>
+                <w:sz w:val="22"/>
+                <w:szCs w:val="22"/>
+                <w:lang w:eastAsia="zh-CN"/>
+              </w:rPr>
+              <w:t xml:space="preserve"> </w:t>
+            </w:r>
+            <w:proofErr w:type="spellStart"/>
+            <w:r>
+              <w:rPr>
+                <w:b/>
+                <w:bCs/>
+                <w:i/>
+                <w:iCs/>
+                <w:sz w:val="22"/>
+                <w:szCs w:val="22"/>
+                <w:lang w:eastAsia="zh-CN"/>
+              </w:rPr>
+              <w:t>trống</w:t>
+            </w:r>
+            <w:proofErr w:type="spellEnd"/>
+            <w:r>
+              <w:rPr>
+                <w:b/>
+                <w:bCs/>
+                <w:i/>
+                <w:iCs/>
+                <w:sz w:val="22"/>
+                <w:szCs w:val="22"/>
+                <w:lang w:eastAsia="zh-CN"/>
+              </w:rPr>
+              <w:t xml:space="preserve"> </w:t>
+            </w:r>
+            <w:proofErr w:type="spellStart"/>
+            <w:r>
+              <w:rPr>
+                <w:b/>
+                <w:bCs/>
+                <w:i/>
+                <w:iCs/>
+                <w:sz w:val="22"/>
+                <w:szCs w:val="22"/>
+                <w:lang w:eastAsia="zh-CN"/>
+              </w:rPr>
+              <w:t>để</w:t>
+            </w:r>
+            <w:proofErr w:type="spellEnd"/>
+            <w:r>
+              <w:rPr>
+                <w:b/>
+                <w:bCs/>
+                <w:i/>
+                <w:iCs/>
+                <w:sz w:val="22"/>
+                <w:szCs w:val="22"/>
+                <w:lang w:eastAsia="zh-CN"/>
+              </w:rPr>
+              <w:t xml:space="preserve"> </w:t>
+            </w:r>
+            <w:proofErr w:type="spellStart"/>
+            <w:r>
+              <w:rPr>
+                <w:b/>
+                <w:bCs/>
+                <w:i/>
+                <w:iCs/>
+                <w:sz w:val="22"/>
+                <w:szCs w:val="22"/>
+                <w:lang w:eastAsia="zh-CN"/>
+              </w:rPr>
+              <w:t>hệ</w:t>
+            </w:r>
+            <w:proofErr w:type="spellEnd"/>
+            <w:r>
+              <w:rPr>
+                <w:b/>
+                <w:bCs/>
+                <w:i/>
+                <w:iCs/>
+                <w:sz w:val="22"/>
+                <w:szCs w:val="22"/>
+                <w:lang w:eastAsia="zh-CN"/>
+              </w:rPr>
+              <w:t xml:space="preserve"> </w:t>
+            </w:r>
+            <w:proofErr w:type="spellStart"/>
+            <w:r>
+              <w:rPr>
+                <w:b/>
+                <w:bCs/>
+                <w:i/>
+                <w:iCs/>
+                <w:sz w:val="22"/>
+                <w:szCs w:val="22"/>
+                <w:lang w:eastAsia="zh-CN"/>
+              </w:rPr>
+              <w:t>thống</w:t>
+            </w:r>
+            <w:proofErr w:type="spellEnd"/>
+            <w:r>
+              <w:rPr>
+                <w:b/>
+                <w:bCs/>
+                <w:i/>
+                <w:iCs/>
+                <w:sz w:val="22"/>
+                <w:szCs w:val="22"/>
+                <w:lang w:eastAsia="zh-CN"/>
+              </w:rPr>
+              <w:t xml:space="preserve"> </w:t>
+            </w:r>
+            <w:proofErr w:type="spellStart"/>
+            <w:r>
+              <w:rPr>
+                <w:b/>
+                <w:bCs/>
+                <w:i/>
+                <w:iCs/>
+                <w:sz w:val="22"/>
+                <w:szCs w:val="22"/>
+                <w:lang w:eastAsia="zh-CN"/>
+              </w:rPr>
+              <w:t>tự</w:t>
+            </w:r>
+            <w:proofErr w:type="spellEnd"/>
+            <w:r>
+              <w:rPr>
+                <w:b/>
+                <w:bCs/>
+                <w:i/>
+                <w:iCs/>
+                <w:sz w:val="22"/>
+                <w:szCs w:val="22"/>
+                <w:lang w:eastAsia="zh-CN"/>
+              </w:rPr>
+              <w:t xml:space="preserve"> </w:t>
+            </w:r>
+            <w:proofErr w:type="spellStart"/>
+            <w:r>
+              <w:rPr>
+                <w:b/>
+                <w:bCs/>
+                <w:i/>
+                <w:iCs/>
+                <w:sz w:val="22"/>
+                <w:szCs w:val="22"/>
+                <w:lang w:eastAsia="zh-CN"/>
+              </w:rPr>
+              <w:t>cập</w:t>
+            </w:r>
+            <w:proofErr w:type="spellEnd"/>
+            <w:r>
+              <w:rPr>
+                <w:b/>
+                <w:bCs/>
+                <w:i/>
+                <w:iCs/>
+                <w:sz w:val="22"/>
+                <w:szCs w:val="22"/>
+                <w:lang w:eastAsia="zh-CN"/>
+              </w:rPr>
+              <w:t xml:space="preserve"> </w:t>
+            </w:r>
+            <w:proofErr w:type="spellStart"/>
+            <w:r>
+              <w:rPr>
+                <w:b/>
+                <w:bCs/>
+                <w:i/>
+                <w:iCs/>
+                <w:sz w:val="22"/>
+                <w:szCs w:val="22"/>
+                <w:lang w:eastAsia="zh-CN"/>
+              </w:rPr>
+              <w:t>nhật</w:t>
+            </w:r>
+            <w:proofErr w:type="spellEnd"/>
+            <w:r>
+              <w:rPr>
+                <w:b/>
+                <w:bCs/>
+                <w:i/>
+                <w:iCs/>
+                <w:sz w:val="22"/>
+                <w:szCs w:val="22"/>
+                <w:lang w:eastAsia="zh-CN"/>
+              </w:rPr>
+              <w:t>).</w:t>
+            </w:r>
+          </w:p>
+          <w:p>
+            <w:pPr>
+              <w:jc w:val="both"/>
+              <w:rPr>
+                <w:rFonts w:ascii="Times New Roman" w:hAnsi="Times New Roman"/>
+                <w:b/>
+                <w:bCs/>
+                <w:i/>
+                <w:iCs/>
+                <w:sz w:val="22"/>
+                <w:lang w:val="en-GB"/>
+              </w:rPr>
+            </w:pPr>
+            <w:r>
+              <w:rPr>
+                <w:rFonts w:ascii="Times New Roman" w:hAnsi="Times New Roman"/>
+                <w:b/>
+                <w:bCs/>
+                <w:i/>
+                <w:iCs/>
+                <w:sz w:val="22"/>
+                <w:szCs w:val="22"/>
+                <w:lang w:val="en-GB" w:eastAsia="zh-CN"/>
+              </w:rPr>
+              <w:t xml:space="preserve">* </w:t>
+            </w:r>
+            <w:proofErr w:type="spellStart"/>
+            <w:r>
+              <w:rPr>
+                <w:rFonts w:ascii="Times New Roman" w:hAnsi="Times New Roman"/>
+                <w:b/>
+                <w:bCs/>
+                <w:i/>
+                <w:iCs/>
+                <w:sz w:val="22"/>
+                <w:szCs w:val="22"/>
+                <w:lang w:val="en-GB" w:eastAsia="zh-CN"/>
+              </w:rPr>
+              <w:t>Phần</w:t>
+            </w:r>
+            <w:proofErr w:type="spellEnd"/>
+            <w:r>
+              <w:rPr>
+                <w:rFonts w:ascii="Times New Roman" w:hAnsi="Times New Roman"/>
+                <w:b/>
+                <w:bCs/>
+                <w:i/>
+                <w:iCs/>
+                <w:sz w:val="22"/>
+                <w:szCs w:val="22"/>
+                <w:lang w:val="en-GB" w:eastAsia="zh-CN"/>
+              </w:rPr>
+              <w:t xml:space="preserve"> </w:t>
+            </w:r>
+            <w:proofErr w:type="spellStart"/>
+            <w:r>
+              <w:rPr>
+                <w:rFonts w:ascii="Times New Roman" w:hAnsi="Times New Roman"/>
+                <w:b/>
+                <w:bCs/>
+                <w:i/>
+                <w:iCs/>
+                <w:sz w:val="22"/>
+                <w:szCs w:val="22"/>
+                <w:lang w:val="en-GB" w:eastAsia="zh-CN"/>
+              </w:rPr>
+              <w:t>đề</w:t>
+            </w:r>
+            <w:proofErr w:type="spellEnd"/>
+            <w:r>
+              <w:rPr>
+                <w:rFonts w:ascii="Times New Roman" w:hAnsi="Times New Roman"/>
+                <w:b/>
+                <w:bCs/>
+                <w:i/>
+                <w:iCs/>
+                <w:sz w:val="22"/>
+                <w:szCs w:val="22"/>
+                <w:lang w:val="en-GB" w:eastAsia="zh-CN"/>
+              </w:rPr>
+              <w:t xml:space="preserve"> </w:t>
+            </w:r>
+            <w:proofErr w:type="spellStart"/>
+            <w:r>
+              <w:rPr>
+                <w:rFonts w:ascii="Times New Roman" w:hAnsi="Times New Roman"/>
+                <w:b/>
+                <w:bCs/>
+                <w:i/>
+                <w:iCs/>
+                <w:sz w:val="22"/>
+                <w:szCs w:val="22"/>
+                <w:lang w:val="en-GB" w:eastAsia="zh-CN"/>
+              </w:rPr>
+              <w:t>ký</w:t>
+            </w:r>
+            <w:proofErr w:type="spellEnd"/>
+            <w:r>
+              <w:rPr>
+                <w:rFonts w:ascii="Times New Roman" w:hAnsi="Times New Roman"/>
+                <w:b/>
+                <w:bCs/>
+                <w:i/>
+                <w:iCs/>
+                <w:sz w:val="22"/>
+                <w:szCs w:val="22"/>
+                <w:lang w:val="en-GB" w:eastAsia="zh-CN"/>
+              </w:rPr>
+              <w:t xml:space="preserve">: </w:t>
+            </w:r>
+            <w:proofErr w:type="spellStart"/>
+            <w:r>
+              <w:rPr>
+                <w:rFonts w:ascii="Times New Roman" w:hAnsi="Times New Roman"/>
+                <w:b/>
+                <w:bCs/>
+                <w:i/>
+                <w:iCs/>
+                <w:sz w:val="22"/>
+                <w:szCs w:val="22"/>
+                <w:lang w:val="en-GB" w:eastAsia="zh-CN"/>
+              </w:rPr>
+              <w:t>để</w:t>
+            </w:r>
+            <w:proofErr w:type="spellEnd"/>
+            <w:r>
+              <w:rPr>
+                <w:rFonts w:ascii="Times New Roman" w:hAnsi="Times New Roman"/>
+                <w:b/>
+                <w:bCs/>
+                <w:i/>
+                <w:iCs/>
+                <w:sz w:val="22"/>
+                <w:szCs w:val="22"/>
+                <w:lang w:val="en-GB" w:eastAsia="zh-CN"/>
+              </w:rPr>
+              <w:t xml:space="preserve"> </w:t>
+            </w:r>
+            <w:proofErr w:type="spellStart"/>
+            <w:r>
+              <w:rPr>
+                <w:rFonts w:ascii="Times New Roman" w:hAnsi="Times New Roman"/>
+                <w:b/>
+                <w:bCs/>
+                <w:i/>
+                <w:iCs/>
+                <w:sz w:val="22"/>
+                <w:szCs w:val="22"/>
+                <w:lang w:val="en-GB" w:eastAsia="zh-CN"/>
+              </w:rPr>
+              <w:t>khoảng</w:t>
+            </w:r>
+            <w:proofErr w:type="spellEnd"/>
+            <w:r>
+              <w:rPr>
+                <w:rFonts w:ascii="Times New Roman" w:hAnsi="Times New Roman"/>
+                <w:b/>
+                <w:bCs/>
+                <w:i/>
+                <w:iCs/>
+                <w:sz w:val="22"/>
+                <w:szCs w:val="22"/>
+                <w:lang w:val="en-GB" w:eastAsia="zh-CN"/>
+              </w:rPr>
+              <w:t xml:space="preserve"> </w:t>
+            </w:r>
+            <w:proofErr w:type="spellStart"/>
+            <w:r>
+              <w:rPr>
+                <w:rFonts w:ascii="Times New Roman" w:hAnsi="Times New Roman"/>
+                <w:b/>
+                <w:bCs/>
+                <w:i/>
+                <w:iCs/>
+                <w:sz w:val="22"/>
+                <w:szCs w:val="22"/>
+                <w:lang w:val="en-GB" w:eastAsia="zh-CN"/>
+              </w:rPr>
+              <w:t>cách</w:t>
+            </w:r>
+            <w:proofErr w:type="spellEnd"/>
+            <w:r>
+              <w:rPr>
+                <w:rFonts w:ascii="Times New Roman" w:hAnsi="Times New Roman"/>
+                <w:b/>
+                <w:bCs/>
+                <w:i/>
+                <w:iCs/>
+                <w:sz w:val="22"/>
+                <w:szCs w:val="22"/>
+                <w:lang w:val="en-GB" w:eastAsia="zh-CN"/>
+              </w:rPr>
+              <w:t xml:space="preserve"> (</w:t>
+            </w:r>
+            <w:proofErr w:type="spellStart"/>
+            <w:r>
+              <w:rPr>
+                <w:rFonts w:ascii="Times New Roman" w:hAnsi="Times New Roman"/>
+                <w:b/>
+                <w:bCs/>
+                <w:i/>
+                <w:iCs/>
+                <w:sz w:val="22"/>
+                <w:szCs w:val="22"/>
+                <w:lang w:val="en-GB" w:eastAsia="zh-CN"/>
+              </w:rPr>
+              <w:t>thông</w:t>
+            </w:r>
+            <w:proofErr w:type="spellEnd"/>
+            <w:r>
+              <w:rPr>
+                <w:rFonts w:ascii="Times New Roman" w:hAnsi="Times New Roman"/>
+                <w:b/>
+                <w:bCs/>
+                <w:i/>
+                <w:iCs/>
+                <w:sz w:val="22"/>
+                <w:szCs w:val="22"/>
+                <w:lang w:val="en-GB" w:eastAsia="zh-CN"/>
+              </w:rPr>
+              <w:t xml:space="preserve"> </w:t>
+            </w:r>
+            <w:proofErr w:type="spellStart"/>
+            <w:r>
+              <w:rPr>
+                <w:rFonts w:ascii="Times New Roman" w:hAnsi="Times New Roman"/>
+                <w:b/>
+                <w:bCs/>
+                <w:i/>
+                <w:iCs/>
+                <w:sz w:val="22"/>
+                <w:szCs w:val="22"/>
+                <w:lang w:val="en-GB" w:eastAsia="zh-CN"/>
+              </w:rPr>
+              <w:t>thủy</w:t>
+            </w:r>
+            <w:proofErr w:type="spellEnd"/>
+            <w:r>
+              <w:rPr>
+                <w:rFonts w:ascii="Times New Roman" w:hAnsi="Times New Roman"/>
+                <w:b/>
+                <w:bCs/>
+                <w:i/>
+                <w:iCs/>
+                <w:sz w:val="22"/>
+                <w:szCs w:val="22"/>
+                <w:lang w:val="en-GB" w:eastAsia="zh-CN"/>
+              </w:rPr>
+              <w:t xml:space="preserve">) </w:t>
+            </w:r>
+            <w:proofErr w:type="spellStart"/>
+            <w:r>
+              <w:rPr>
+                <w:rFonts w:ascii="Times New Roman" w:hAnsi="Times New Roman"/>
+                <w:b/>
+                <w:bCs/>
+                <w:i/>
+                <w:iCs/>
+                <w:sz w:val="22"/>
+                <w:lang w:val="en-GB"/>
+              </w:rPr>
+              <w:t>từ</w:t>
+            </w:r>
+            <w:proofErr w:type="spellEnd"/>
+            <w:r>
+              <w:rPr>
+                <w:rFonts w:ascii="Times New Roman" w:hAnsi="Times New Roman"/>
+                <w:b/>
+                <w:bCs/>
+                <w:i/>
+                <w:iCs/>
+                <w:sz w:val="22"/>
+                <w:lang w:val="en-GB"/>
+              </w:rPr>
+              <w:t xml:space="preserve"> </w:t>
+            </w:r>
+            <w:proofErr w:type="spellStart"/>
+            <w:r>
+              <w:rPr>
+                <w:rFonts w:ascii="Times New Roman" w:hAnsi="Times New Roman"/>
+                <w:b/>
+                <w:bCs/>
+                <w:i/>
+                <w:iCs/>
+                <w:sz w:val="22"/>
+                <w:lang w:val="en-GB"/>
+              </w:rPr>
+              <w:t>chân</w:t>
+            </w:r>
+            <w:proofErr w:type="spellEnd"/>
+            <w:r>
+              <w:rPr>
+                <w:rFonts w:ascii="Times New Roman" w:hAnsi="Times New Roman"/>
+                <w:b/>
+                <w:bCs/>
+                <w:i/>
+                <w:iCs/>
+                <w:sz w:val="22"/>
+                <w:lang w:val="en-GB"/>
+              </w:rPr>
+              <w:t xml:space="preserve"> </w:t>
+            </w:r>
+            <w:proofErr w:type="spellStart"/>
+            <w:r>
+              <w:rPr>
+                <w:rFonts w:ascii="Times New Roman" w:hAnsi="Times New Roman"/>
+                <w:b/>
+                <w:bCs/>
+                <w:i/>
+                <w:iCs/>
+                <w:sz w:val="22"/>
+                <w:lang w:val="en-GB"/>
+              </w:rPr>
+              <w:t>dòng</w:t>
+            </w:r>
+            <w:proofErr w:type="spellEnd"/>
+            <w:r>
+              <w:rPr>
+                <w:rFonts w:ascii="Times New Roman" w:hAnsi="Times New Roman"/>
+                <w:b/>
+                <w:bCs/>
+                <w:i/>
+                <w:iCs/>
+                <w:sz w:val="22"/>
+                <w:lang w:val="en-GB"/>
+              </w:rPr>
+              <w:t xml:space="preserve"> </w:t>
+            </w:r>
+            <w:proofErr w:type="spellStart"/>
+            <w:r>
+              <w:rPr>
+                <w:rFonts w:ascii="Times New Roman" w:hAnsi="Times New Roman"/>
+                <w:b/>
+                <w:bCs/>
+                <w:i/>
+                <w:iCs/>
+                <w:sz w:val="22"/>
+                <w:lang w:val="en-GB"/>
+              </w:rPr>
+              <w:t>ghi</w:t>
+            </w:r>
+            <w:proofErr w:type="spellEnd"/>
+            <w:r>
+              <w:rPr>
+                <w:rFonts w:ascii="Times New Roman" w:hAnsi="Times New Roman"/>
+                <w:b/>
+                <w:bCs/>
+                <w:i/>
+                <w:iCs/>
+                <w:sz w:val="22"/>
+                <w:lang w:val="en-GB"/>
+              </w:rPr>
+              <w:t xml:space="preserve"> </w:t>
+            </w:r>
+            <w:proofErr w:type="spellStart"/>
+            <w:r>
+              <w:rPr>
+                <w:rFonts w:ascii="Times New Roman" w:hAnsi="Times New Roman"/>
+                <w:b/>
+                <w:bCs/>
+                <w:i/>
+                <w:iCs/>
+                <w:sz w:val="22"/>
+                <w:lang w:val="en-GB"/>
+              </w:rPr>
+              <w:t>chức</w:t>
+            </w:r>
+            <w:proofErr w:type="spellEnd"/>
+            <w:r>
+              <w:rPr>
+                <w:rFonts w:ascii="Times New Roman" w:hAnsi="Times New Roman"/>
+                <w:b/>
+                <w:bCs/>
+                <w:i/>
+                <w:iCs/>
+                <w:sz w:val="22"/>
+                <w:lang w:val="en-GB"/>
+              </w:rPr>
+              <w:t xml:space="preserve"> </w:t>
+            </w:r>
+            <w:proofErr w:type="spellStart"/>
+            <w:r>
+              <w:rPr>
+                <w:rFonts w:ascii="Times New Roman" w:hAnsi="Times New Roman"/>
+                <w:b/>
+                <w:bCs/>
+                <w:i/>
+                <w:iCs/>
+                <w:sz w:val="22"/>
+                <w:lang w:val="en-GB"/>
+              </w:rPr>
+              <w:t>vụ</w:t>
+            </w:r>
+            <w:proofErr w:type="spellEnd"/>
+            <w:r>
+              <w:rPr>
+                <w:rFonts w:ascii="Times New Roman" w:hAnsi="Times New Roman"/>
+                <w:b/>
+                <w:bCs/>
+                <w:i/>
+                <w:iCs/>
+                <w:sz w:val="22"/>
+                <w:lang w:val="en-GB"/>
+              </w:rPr>
+              <w:t xml:space="preserve"> </w:t>
+            </w:r>
+            <w:proofErr w:type="spellStart"/>
+            <w:r>
+              <w:rPr>
+                <w:rFonts w:ascii="Times New Roman" w:hAnsi="Times New Roman"/>
+                <w:b/>
+                <w:bCs/>
+                <w:i/>
+                <w:iCs/>
+                <w:sz w:val="22"/>
+                <w:lang w:val="en-GB"/>
+              </w:rPr>
+              <w:t>bên</w:t>
+            </w:r>
+            <w:proofErr w:type="spellEnd"/>
+            <w:r>
+              <w:rPr>
+                <w:rFonts w:ascii="Times New Roman" w:hAnsi="Times New Roman"/>
+                <w:b/>
+                <w:bCs/>
+                <w:i/>
+                <w:iCs/>
+                <w:sz w:val="22"/>
+                <w:lang w:val="en-GB"/>
+              </w:rPr>
+              <w:t xml:space="preserve"> </w:t>
+            </w:r>
+            <w:proofErr w:type="spellStart"/>
+            <w:r>
+              <w:rPr>
+                <w:rFonts w:ascii="Times New Roman" w:hAnsi="Times New Roman"/>
+                <w:b/>
+                <w:bCs/>
+                <w:i/>
+                <w:iCs/>
+                <w:sz w:val="22"/>
+                <w:lang w:val="en-GB"/>
+              </w:rPr>
+              <w:t>trên</w:t>
+            </w:r>
+            <w:proofErr w:type="spellEnd"/>
+            <w:r>
+              <w:rPr>
+                <w:rFonts w:ascii="Times New Roman" w:hAnsi="Times New Roman"/>
+                <w:b/>
+                <w:bCs/>
+                <w:i/>
+                <w:iCs/>
+                <w:sz w:val="22"/>
+                <w:lang w:val="en-GB"/>
+              </w:rPr>
+              <w:t xml:space="preserve"> </w:t>
+            </w:r>
+            <w:proofErr w:type="spellStart"/>
+            <w:r>
+              <w:rPr>
+                <w:rFonts w:ascii="Times New Roman" w:hAnsi="Times New Roman"/>
+                <w:b/>
+                <w:bCs/>
+                <w:i/>
+                <w:iCs/>
+                <w:sz w:val="22"/>
+                <w:lang w:val="en-GB"/>
+              </w:rPr>
+              <w:t>đến</w:t>
+            </w:r>
+            <w:proofErr w:type="spellEnd"/>
+            <w:r>
+              <w:rPr>
+                <w:rFonts w:ascii="Times New Roman" w:hAnsi="Times New Roman"/>
+                <w:b/>
+                <w:bCs/>
+                <w:i/>
+                <w:iCs/>
+                <w:sz w:val="22"/>
+                <w:lang w:val="en-GB"/>
+              </w:rPr>
+              <w:t xml:space="preserve"> </w:t>
+            </w:r>
+            <w:proofErr w:type="spellStart"/>
+            <w:r>
+              <w:rPr>
+                <w:rFonts w:ascii="Times New Roman" w:hAnsi="Times New Roman"/>
+                <w:b/>
+                <w:bCs/>
+                <w:i/>
+                <w:iCs/>
+                <w:sz w:val="22"/>
+                <w:lang w:val="en-GB"/>
+              </w:rPr>
+              <w:t>dòng</w:t>
+            </w:r>
+            <w:proofErr w:type="spellEnd"/>
+            <w:r>
+              <w:rPr>
+                <w:rFonts w:ascii="Times New Roman" w:hAnsi="Times New Roman"/>
+                <w:b/>
+                <w:bCs/>
+                <w:i/>
+                <w:iCs/>
+                <w:sz w:val="22"/>
+                <w:lang w:val="en-GB"/>
+              </w:rPr>
+              <w:t xml:space="preserve"> </w:t>
+            </w:r>
+            <w:proofErr w:type="spellStart"/>
+            <w:r>
+              <w:rPr>
+                <w:rFonts w:ascii="Times New Roman" w:hAnsi="Times New Roman"/>
+                <w:b/>
+                <w:bCs/>
+                <w:i/>
+                <w:iCs/>
+                <w:sz w:val="22"/>
+                <w:lang w:val="en-GB"/>
+              </w:rPr>
+              <w:t>ghi</w:t>
+            </w:r>
+            <w:proofErr w:type="spellEnd"/>
+            <w:r>
+              <w:rPr>
+                <w:rFonts w:ascii="Times New Roman" w:hAnsi="Times New Roman"/>
+                <w:b/>
+                <w:bCs/>
+                <w:i/>
+                <w:iCs/>
+                <w:sz w:val="22"/>
+                <w:lang w:val="en-GB"/>
+              </w:rPr>
+              <w:t xml:space="preserve"> </w:t>
+            </w:r>
+            <w:proofErr w:type="spellStart"/>
+            <w:r>
+              <w:rPr>
+                <w:rFonts w:ascii="Times New Roman" w:hAnsi="Times New Roman"/>
+                <w:b/>
+                <w:bCs/>
+                <w:i/>
+                <w:iCs/>
+                <w:sz w:val="22"/>
+                <w:lang w:val="en-GB"/>
+              </w:rPr>
+              <w:t>họ</w:t>
+            </w:r>
+            <w:proofErr w:type="spellEnd"/>
+            <w:r>
+              <w:rPr>
+                <w:rFonts w:ascii="Times New Roman" w:hAnsi="Times New Roman"/>
+                <w:b/>
+                <w:bCs/>
+                <w:i/>
+                <w:iCs/>
+                <w:sz w:val="22"/>
+                <w:lang w:val="en-GB"/>
+              </w:rPr>
+              <w:t xml:space="preserve"> </w:t>
+            </w:r>
+            <w:proofErr w:type="spellStart"/>
+            <w:r>
+              <w:rPr>
+                <w:rFonts w:ascii="Times New Roman" w:hAnsi="Times New Roman"/>
+                <w:b/>
+                <w:bCs/>
+                <w:i/>
+                <w:iCs/>
+                <w:sz w:val="22"/>
+                <w:lang w:val="en-GB"/>
+              </w:rPr>
+              <w:t>và</w:t>
+            </w:r>
+            <w:proofErr w:type="spellEnd"/>
+            <w:r>
+              <w:rPr>
+                <w:rFonts w:ascii="Times New Roman" w:hAnsi="Times New Roman"/>
+                <w:b/>
+                <w:bCs/>
+                <w:i/>
+                <w:iCs/>
+                <w:sz w:val="22"/>
+                <w:lang w:val="en-GB"/>
+              </w:rPr>
+              <w:t xml:space="preserve"> </w:t>
+            </w:r>
+            <w:proofErr w:type="spellStart"/>
+            <w:r>
+              <w:rPr>
+                <w:rFonts w:ascii="Times New Roman" w:hAnsi="Times New Roman"/>
+                <w:b/>
+                <w:bCs/>
+                <w:i/>
+                <w:iCs/>
+                <w:sz w:val="22"/>
+                <w:lang w:val="en-GB"/>
+              </w:rPr>
+              <w:t>tên</w:t>
+            </w:r>
+            <w:proofErr w:type="spellEnd"/>
+            <w:r>
+              <w:rPr>
+                <w:rFonts w:ascii="Times New Roman" w:hAnsi="Times New Roman"/>
+                <w:b/>
+                <w:bCs/>
+                <w:i/>
+                <w:iCs/>
+                <w:sz w:val="22"/>
+                <w:lang w:val="en-GB"/>
+              </w:rPr>
+              <w:t xml:space="preserve"> </w:t>
+            </w:r>
+            <w:proofErr w:type="spellStart"/>
+            <w:r>
+              <w:rPr>
+                <w:rFonts w:ascii="Times New Roman" w:hAnsi="Times New Roman"/>
+                <w:b/>
+                <w:bCs/>
+                <w:i/>
+                <w:iCs/>
+                <w:sz w:val="22"/>
+                <w:lang w:val="en-GB"/>
+              </w:rPr>
+              <w:t>của</w:t>
+            </w:r>
+            <w:proofErr w:type="spellEnd"/>
+            <w:r>
+              <w:rPr>
+                <w:rFonts w:ascii="Times New Roman" w:hAnsi="Times New Roman"/>
+                <w:b/>
+                <w:bCs/>
+                <w:i/>
+                <w:iCs/>
+                <w:sz w:val="22"/>
+                <w:lang w:val="en-GB"/>
+              </w:rPr>
+              <w:t xml:space="preserve"> </w:t>
+            </w:r>
+            <w:proofErr w:type="spellStart"/>
+            <w:r>
+              <w:rPr>
+                <w:rFonts w:ascii="Times New Roman" w:hAnsi="Times New Roman"/>
+                <w:b/>
+                <w:bCs/>
+                <w:i/>
+                <w:iCs/>
+                <w:sz w:val="22"/>
+                <w:lang w:val="en-GB"/>
+              </w:rPr>
+              <w:t>người</w:t>
+            </w:r>
+            <w:proofErr w:type="spellEnd"/>
+            <w:r>
+              <w:rPr>
+                <w:rFonts w:ascii="Times New Roman" w:hAnsi="Times New Roman"/>
+                <w:b/>
+                <w:bCs/>
+                <w:i/>
+                <w:iCs/>
+                <w:sz w:val="22"/>
+                <w:lang w:val="en-GB"/>
+              </w:rPr>
+              <w:t xml:space="preserve"> </w:t>
+            </w:r>
+            <w:proofErr w:type="spellStart"/>
+            <w:r>
+              <w:rPr>
+                <w:rFonts w:ascii="Times New Roman" w:hAnsi="Times New Roman"/>
+                <w:b/>
+                <w:bCs/>
+                <w:i/>
+                <w:iCs/>
+                <w:sz w:val="22"/>
+                <w:lang w:val="en-GB"/>
+              </w:rPr>
+              <w:t>ký</w:t>
+            </w:r>
+            <w:proofErr w:type="spellEnd"/>
+            <w:r>
+              <w:rPr>
+                <w:rFonts w:ascii="Times New Roman" w:hAnsi="Times New Roman"/>
+                <w:b/>
+                <w:bCs/>
+                <w:i/>
+                <w:iCs/>
+                <w:sz w:val="22"/>
+                <w:lang w:val="en-GB"/>
+              </w:rPr>
+              <w:t xml:space="preserve"> </w:t>
+            </w:r>
+            <w:proofErr w:type="spellStart"/>
+            <w:r>
+              <w:rPr>
+                <w:rFonts w:ascii="Times New Roman" w:hAnsi="Times New Roman"/>
+                <w:b/>
+                <w:bCs/>
+                <w:i/>
+                <w:iCs/>
+                <w:sz w:val="22"/>
+                <w:lang w:val="en-GB"/>
+              </w:rPr>
+              <w:t>văn</w:t>
+            </w:r>
+            <w:proofErr w:type="spellEnd"/>
+            <w:r>
+              <w:rPr>
+                <w:rFonts w:ascii="Times New Roman" w:hAnsi="Times New Roman"/>
+                <w:b/>
+                <w:bCs/>
+                <w:i/>
+                <w:iCs/>
+                <w:sz w:val="22"/>
+                <w:lang w:val="en-GB"/>
+              </w:rPr>
+              <w:t xml:space="preserve"> </w:t>
+            </w:r>
+            <w:proofErr w:type="spellStart"/>
+            <w:r>
+              <w:rPr>
+                <w:rFonts w:ascii="Times New Roman" w:hAnsi="Times New Roman"/>
+                <w:b/>
+                <w:bCs/>
+                <w:i/>
+                <w:iCs/>
+                <w:sz w:val="22"/>
+                <w:lang w:val="en-GB"/>
+              </w:rPr>
+              <w:t>bản</w:t>
+            </w:r>
+            <w:proofErr w:type="spellEnd"/>
+            <w:r>
+              <w:rPr>
+                <w:rFonts w:ascii="Times New Roman" w:hAnsi="Times New Roman"/>
+                <w:b/>
+                <w:bCs/>
+                <w:i/>
+                <w:iCs/>
+                <w:sz w:val="22"/>
+                <w:lang w:val="en-GB"/>
+              </w:rPr>
+              <w:t xml:space="preserve"> </w:t>
+            </w:r>
+            <w:proofErr w:type="spellStart"/>
+            <w:r>
+              <w:rPr>
+                <w:rFonts w:ascii="Times New Roman" w:hAnsi="Times New Roman"/>
+                <w:b/>
+                <w:bCs/>
+                <w:i/>
+                <w:iCs/>
+                <w:sz w:val="22"/>
+                <w:lang w:val="en-GB"/>
+              </w:rPr>
+              <w:t>bên</w:t>
+            </w:r>
+            <w:proofErr w:type="spellEnd"/>
+            <w:r>
+              <w:rPr>
+                <w:rFonts w:ascii="Times New Roman" w:hAnsi="Times New Roman"/>
+                <w:b/>
+                <w:bCs/>
+                <w:i/>
+                <w:iCs/>
+                <w:sz w:val="22"/>
+                <w:lang w:val="en-GB"/>
+              </w:rPr>
+              <w:t xml:space="preserve"> </w:t>
+            </w:r>
+            <w:proofErr w:type="spellStart"/>
+            <w:r>
+              <w:rPr>
+                <w:rFonts w:ascii="Times New Roman" w:hAnsi="Times New Roman"/>
+                <w:b/>
+                <w:bCs/>
+                <w:i/>
+                <w:iCs/>
+                <w:sz w:val="22"/>
+                <w:lang w:val="en-GB"/>
+              </w:rPr>
+              <w:t>dưới</w:t>
+            </w:r>
+            <w:proofErr w:type="spellEnd"/>
+            <w:r>
+              <w:rPr>
+                <w:rFonts w:ascii="Times New Roman" w:hAnsi="Times New Roman"/>
+                <w:b/>
+                <w:bCs/>
+                <w:i/>
+                <w:iCs/>
+                <w:sz w:val="22"/>
+                <w:lang w:val="en-GB"/>
+              </w:rPr>
+              <w:t xml:space="preserve"> </w:t>
+            </w:r>
+            <w:proofErr w:type="spellStart"/>
+            <w:r>
+              <w:rPr>
+                <w:rFonts w:ascii="Times New Roman" w:hAnsi="Times New Roman"/>
+                <w:b/>
+                <w:bCs/>
+                <w:i/>
+                <w:iCs/>
+                <w:sz w:val="22"/>
+                <w:lang w:val="en-GB"/>
+              </w:rPr>
+              <w:t>từ</w:t>
+            </w:r>
+            <w:proofErr w:type="spellEnd"/>
+            <w:r>
+              <w:rPr>
+                <w:rFonts w:ascii="Times New Roman" w:hAnsi="Times New Roman"/>
+                <w:b/>
+                <w:bCs/>
+                <w:i/>
+                <w:iCs/>
+                <w:sz w:val="22"/>
+                <w:lang w:val="en-GB"/>
+              </w:rPr>
+              <w:t xml:space="preserve"> 4,5cm </w:t>
+            </w:r>
+            <w:proofErr w:type="spellStart"/>
+            <w:r>
+              <w:rPr>
+                <w:rFonts w:ascii="Times New Roman" w:hAnsi="Times New Roman"/>
+                <w:b/>
+                <w:bCs/>
+                <w:i/>
+                <w:iCs/>
+                <w:sz w:val="22"/>
+                <w:lang w:val="en-GB"/>
+              </w:rPr>
+              <w:t>đến</w:t>
+            </w:r>
+            <w:proofErr w:type="spellEnd"/>
+            <w:r>
+              <w:rPr>
+                <w:rFonts w:ascii="Times New Roman" w:hAnsi="Times New Roman"/>
+                <w:b/>
+                <w:bCs/>
+                <w:i/>
+                <w:iCs/>
+                <w:sz w:val="22"/>
+                <w:lang w:val="en-GB"/>
+              </w:rPr>
+              <w:t xml:space="preserve"> 5 cm)</w:t>
+            </w:r>
+          </w:p>
+          <w:p>
+            <w:pPr>
+              <w:pStyle w:val="FootnoteText"/>
+              <w:jc w:val="both"/>
+              <w:rPr>
+                <w:sz w:val="22"/>
+                <w:szCs w:val="22"/>
+              </w:rPr>
+            </w:pPr>
+            <w:r>
+              <w:rPr>
+                <w:sz w:val="22"/>
+                <w:szCs w:val="22"/>
+              </w:rPr>
+              <w:t>(</w:t>
+            </w:r>
+            <w:r>
+              <w:rPr>
+                <w:sz w:val="22"/>
+                <w:szCs w:val="22"/>
+              </w:rPr>
+              <w:t>1</w:t>
+            </w:r>
+            <w:r>
+              <w:rPr>
+                <w:sz w:val="22"/>
+                <w:szCs w:val="22"/>
+              </w:rPr>
+              <w:t xml:space="preserve">) </w:t>
+            </w:r>
+            <w:proofErr w:type="spellStart"/>
+            <w:r>
+              <w:rPr>
+                <w:sz w:val="22"/>
+                <w:szCs w:val="22"/>
+              </w:rPr>
+              <w:t>Tên</w:t>
+            </w:r>
+            <w:proofErr w:type="spellEnd"/>
+            <w:r>
+              <w:rPr>
+                <w:sz w:val="22"/>
+                <w:szCs w:val="22"/>
+              </w:rPr>
+              <w:t xml:space="preserve"> </w:t>
+            </w:r>
+            <w:proofErr w:type="spellStart"/>
+            <w:r>
+              <w:rPr>
+                <w:sz w:val="22"/>
+                <w:szCs w:val="22"/>
+              </w:rPr>
+              <w:t>đơn</w:t>
+            </w:r>
+            <w:proofErr w:type="spellEnd"/>
+            <w:r>
+              <w:rPr>
+                <w:sz w:val="22"/>
+                <w:szCs w:val="22"/>
+              </w:rPr>
+              <w:t xml:space="preserve"> </w:t>
+            </w:r>
+            <w:proofErr w:type="spellStart"/>
+            <w:r>
+              <w:rPr>
+                <w:sz w:val="22"/>
+                <w:szCs w:val="22"/>
+              </w:rPr>
+              <w:t>vị</w:t>
+            </w:r>
+            <w:proofErr w:type="spellEnd"/>
+            <w:r>
+              <w:rPr>
+                <w:sz w:val="22"/>
+                <w:szCs w:val="22"/>
+              </w:rPr>
+              <w:t xml:space="preserve"> </w:t>
+            </w:r>
+            <w:r>
+              <w:rPr>
+                <w:sz w:val="22"/>
+                <w:szCs w:val="22"/>
+              </w:rPr>
+              <w:t xml:space="preserve">ban </w:t>
+            </w:r>
+            <w:proofErr w:type="spellStart"/>
+            <w:r>
+              <w:rPr>
+                <w:sz w:val="22"/>
+                <w:szCs w:val="22"/>
+              </w:rPr>
+              <w:t>hành</w:t>
+            </w:r>
+            <w:proofErr w:type="spellEnd"/>
+            <w:r>
+              <w:rPr>
+                <w:sz w:val="22"/>
+                <w:szCs w:val="22"/>
+              </w:rPr>
+              <w:t xml:space="preserve"> </w:t>
+            </w:r>
+            <w:proofErr w:type="spellStart"/>
+            <w:r>
+              <w:rPr>
+                <w:sz w:val="22"/>
+                <w:szCs w:val="22"/>
+              </w:rPr>
+              <w:t>văn</w:t>
+            </w:r>
+            <w:proofErr w:type="spellEnd"/>
+            <w:r>
+              <w:rPr>
+                <w:sz w:val="22"/>
+                <w:szCs w:val="22"/>
+              </w:rPr>
+              <w:t xml:space="preserve"> </w:t>
+            </w:r>
+            <w:proofErr w:type="spellStart"/>
+            <w:r>
+              <w:rPr>
+                <w:sz w:val="22"/>
+                <w:szCs w:val="22"/>
+              </w:rPr>
+              <w:t>bản</w:t>
+            </w:r>
+            <w:proofErr w:type="spellEnd"/>
+            <w:r>
+              <w:rPr>
+                <w:sz w:val="22"/>
+                <w:szCs w:val="22"/>
+              </w:rPr>
+              <w:t xml:space="preserve">, </w:t>
+            </w:r>
+            <w:r>
+              <w:rPr>
+                <w:sz w:val="22"/>
+                <w:szCs w:val="22"/>
+              </w:rPr>
+              <w:t>(</w:t>
+            </w:r>
+            <w:proofErr w:type="spellStart"/>
+            <w:r>
+              <w:rPr>
+                <w:sz w:val="22"/>
+                <w:szCs w:val="22"/>
+              </w:rPr>
+              <w:t>chữ</w:t>
+            </w:r>
+            <w:proofErr w:type="spellEnd"/>
+            <w:r>
+              <w:rPr>
+                <w:sz w:val="22"/>
+                <w:szCs w:val="22"/>
+              </w:rPr>
+              <w:t xml:space="preserve"> in </w:t>
+            </w:r>
+            <w:proofErr w:type="spellStart"/>
+            <w:r>
+              <w:rPr>
+                <w:sz w:val="22"/>
+                <w:szCs w:val="22"/>
+              </w:rPr>
+              <w:t>hoa</w:t>
+            </w:r>
+            <w:proofErr w:type="spellEnd"/>
+            <w:r>
+              <w:rPr>
+                <w:sz w:val="22"/>
+                <w:szCs w:val="22"/>
+              </w:rPr>
+              <w:t xml:space="preserve">, </w:t>
+            </w:r>
+            <w:proofErr w:type="spellStart"/>
+            <w:r>
+              <w:rPr>
+                <w:rFonts w:hint="eastAsia"/>
+                <w:sz w:val="22"/>
+                <w:szCs w:val="22"/>
+              </w:rPr>
+              <w:t>đ</w:t>
+            </w:r>
+            <w:r>
+              <w:rPr>
+                <w:sz w:val="22"/>
+                <w:szCs w:val="22"/>
+              </w:rPr>
+              <w:t>ứng</w:t>
+            </w:r>
+            <w:proofErr w:type="spellEnd"/>
+            <w:r>
+              <w:rPr>
+                <w:sz w:val="22"/>
+                <w:szCs w:val="22"/>
+              </w:rPr>
+              <w:t>,</w:t>
+            </w:r>
+            <w:r>
+              <w:rPr>
+                <w:sz w:val="22"/>
+                <w:szCs w:val="22"/>
+              </w:rPr>
+              <w:t xml:space="preserve"> </w:t>
+            </w:r>
+            <w:proofErr w:type="spellStart"/>
+            <w:r>
+              <w:rPr>
+                <w:rFonts w:hint="eastAsia"/>
+                <w:sz w:val="22"/>
+                <w:szCs w:val="22"/>
+              </w:rPr>
+              <w:t>đ</w:t>
+            </w:r>
+            <w:r>
+              <w:rPr>
+                <w:sz w:val="22"/>
+                <w:szCs w:val="22"/>
+              </w:rPr>
+              <w:t>ậm</w:t>
+            </w:r>
+            <w:proofErr w:type="spellEnd"/>
+            <w:r>
+              <w:rPr>
+                <w:sz w:val="22"/>
+                <w:szCs w:val="22"/>
+              </w:rPr>
+              <w:t>)</w:t>
+            </w:r>
+            <w:r>
+              <w:rPr>
+                <w:sz w:val="22"/>
+                <w:szCs w:val="22"/>
+              </w:rPr>
+              <w:t xml:space="preserve"> </w:t>
+            </w:r>
+          </w:p>
+          <w:p>
+            <w:pPr>
+              <w:pStyle w:val="FootnoteText"/>
+              <w:jc w:val="both"/>
+              <w:rPr>
+                <w:sz w:val="22"/>
+                <w:szCs w:val="22"/>
+              </w:rPr>
+            </w:pPr>
+            <w:r>
+              <w:rPr>
+                <w:sz w:val="22"/>
+                <w:szCs w:val="22"/>
+              </w:rPr>
+              <w:t>(</w:t>
+            </w:r>
+            <w:r>
+              <w:rPr>
+                <w:sz w:val="22"/>
+                <w:szCs w:val="22"/>
+              </w:rPr>
+              <w:t>2</w:t>
+            </w:r>
+            <w:r>
+              <w:rPr>
+                <w:sz w:val="22"/>
+                <w:szCs w:val="22"/>
+              </w:rPr>
+              <w:t xml:space="preserve">) </w:t>
+            </w:r>
+            <w:proofErr w:type="spellStart"/>
+            <w:r>
+              <w:rPr>
+                <w:sz w:val="22"/>
+                <w:szCs w:val="22"/>
+              </w:rPr>
+              <w:t>Ghi</w:t>
+            </w:r>
+            <w:proofErr w:type="spellEnd"/>
+            <w:r>
+              <w:rPr>
+                <w:sz w:val="22"/>
+                <w:szCs w:val="22"/>
+              </w:rPr>
+              <w:t xml:space="preserve"> </w:t>
+            </w:r>
+            <w:proofErr w:type="spellStart"/>
+            <w:r>
+              <w:rPr>
+                <w:sz w:val="22"/>
+                <w:szCs w:val="22"/>
+              </w:rPr>
+              <w:t>đ</w:t>
+            </w:r>
+            <w:r>
+              <w:rPr>
+                <w:sz w:val="22"/>
+                <w:szCs w:val="22"/>
+              </w:rPr>
+              <w:t>ịa</w:t>
+            </w:r>
+            <w:proofErr w:type="spellEnd"/>
+            <w:r>
+              <w:rPr>
+                <w:sz w:val="22"/>
+                <w:szCs w:val="22"/>
+              </w:rPr>
+              <w:t xml:space="preserve"> </w:t>
+            </w:r>
+            <w:proofErr w:type="spellStart"/>
+            <w:r>
+              <w:rPr>
+                <w:sz w:val="22"/>
+                <w:szCs w:val="22"/>
+              </w:rPr>
+              <w:t>danh</w:t>
+            </w:r>
+            <w:proofErr w:type="spellEnd"/>
+            <w:r>
+              <w:rPr>
+                <w:sz w:val="22"/>
+                <w:szCs w:val="22"/>
+              </w:rPr>
+              <w:t>.</w:t>
+            </w:r>
+          </w:p>
+          <w:p>
+            <w:pPr>
+              <w:pStyle w:val="FootnoteText"/>
+              <w:jc w:val="both"/>
+              <w:rPr>
+                <w:sz w:val="22"/>
+                <w:szCs w:val="22"/>
+              </w:rPr>
+            </w:pPr>
+            <w:r>
+              <w:t>(TITLE)</w:t>
+            </w:r>
+          </w:p>
+          <w:p>
+            <w:pPr>
+              <w:pStyle w:val="FootnoteText"/>
+              <w:jc w:val="both"/>
+              <w:rPr>
+                <w:sz w:val="22"/>
+                <w:szCs w:val="22"/>
+              </w:rPr>
+            </w:pPr>
+            <w:r>
+              <w:rPr>
+                <w:sz w:val="22"/>
+                <w:szCs w:val="22"/>
+              </w:rPr>
+              <w:t>(</w:t>
+            </w:r>
+            <w:r>
+              <w:rPr>
+                <w:sz w:val="22"/>
+                <w:szCs w:val="22"/>
+              </w:rPr>
+              <w:t>4</w:t>
+            </w:r>
+            <w:r>
+              <w:rPr>
+                <w:sz w:val="22"/>
+                <w:szCs w:val="22"/>
+              </w:rPr>
+              <w:t xml:space="preserve">) </w:t>
+            </w:r>
+            <w:proofErr w:type="spellStart"/>
+            <w:r>
+              <w:rPr>
+                <w:sz w:val="22"/>
+                <w:szCs w:val="22"/>
+              </w:rPr>
+              <w:t>Nội</w:t>
+            </w:r>
+            <w:proofErr w:type="spellEnd"/>
+            <w:r>
+              <w:rPr>
+                <w:sz w:val="22"/>
+                <w:szCs w:val="22"/>
+              </w:rPr>
+              <w:t xml:space="preserve"> dung </w:t>
+            </w:r>
+            <w:proofErr w:type="spellStart"/>
+            <w:r>
+              <w:rPr>
+                <w:sz w:val="22"/>
+                <w:szCs w:val="22"/>
+              </w:rPr>
+              <w:t>v</w:t>
+            </w:r>
+            <w:r>
+              <w:rPr>
+                <w:rFonts w:hint="eastAsia"/>
+                <w:sz w:val="22"/>
+                <w:szCs w:val="22"/>
+              </w:rPr>
+              <w:t>ă</w:t>
+            </w:r>
+            <w:r>
+              <w:rPr>
+                <w:sz w:val="22"/>
+                <w:szCs w:val="22"/>
+              </w:rPr>
+              <w:t>n</w:t>
+            </w:r>
+            <w:proofErr w:type="spellEnd"/>
+            <w:r>
+              <w:rPr>
+                <w:sz w:val="22"/>
+                <w:szCs w:val="22"/>
+              </w:rPr>
+              <w:t xml:space="preserve"> </w:t>
+            </w:r>
+            <w:proofErr w:type="spellStart"/>
+            <w:r>
+              <w:rPr>
+                <w:sz w:val="22"/>
+                <w:szCs w:val="22"/>
+              </w:rPr>
+              <w:t>bản</w:t>
+            </w:r>
+            <w:proofErr w:type="spellEnd"/>
+            <w:r>
+              <w:rPr>
+                <w:sz w:val="22"/>
+                <w:szCs w:val="22"/>
+              </w:rPr>
+              <w:t>.</w:t>
+            </w:r>
+          </w:p>
+          <w:p>
+            <w:pPr>
+              <w:pStyle w:val="BodyTextIndent"/>
+              <w:spacing w:after="0"/>
+              <w:ind w:firstLine="0"/>
+              <w:rPr>
+                <w:rFonts w:ascii="Times New Roman" w:hAnsi="Times New Roman"/>
+                <w:sz w:val="22"/>
+                <w:szCs w:val="22"/>
+              </w:rPr>
+            </w:pPr>
+            <w:r>
+              <w:rPr>
+                <w:rFonts w:ascii="Times New Roman" w:hAnsi="Times New Roman"/>
+                <w:sz w:val="22"/>
+                <w:szCs w:val="22"/>
+              </w:rPr>
+              <w:t>(</w:t>
+            </w:r>
+            <w:r>
+              <w:rPr>
+                <w:rFonts w:ascii="Times New Roman" w:hAnsi="Times New Roman"/>
+                <w:sz w:val="22"/>
+                <w:szCs w:val="22"/>
+              </w:rPr>
+              <w:t>5</w:t>
+            </w:r>
+            <w:r>
+              <w:rPr>
+                <w:rFonts w:ascii="Times New Roman" w:hAnsi="Times New Roman"/>
+                <w:sz w:val="22"/>
+                <w:szCs w:val="22"/>
+              </w:rPr>
+              <w:t xml:space="preserve">) Quyền </w:t>
+            </w:r>
+            <w:proofErr w:type="spellStart"/>
+            <w:r>
+              <w:rPr>
+                <w:rFonts w:ascii="Times New Roman" w:hAnsi="Times New Roman"/>
+                <w:sz w:val="22"/>
+                <w:szCs w:val="22"/>
+              </w:rPr>
+              <w:t>hạn</w:t>
+            </w:r>
+            <w:proofErr w:type="spellEnd"/>
+            <w:r>
+              <w:rPr>
+                <w:rFonts w:ascii="Times New Roman" w:hAnsi="Times New Roman"/>
+                <w:sz w:val="22"/>
+                <w:szCs w:val="22"/>
+              </w:rPr>
+              <w:t xml:space="preserve">, </w:t>
+            </w:r>
+            <w:proofErr w:type="spellStart"/>
+            <w:r>
+              <w:rPr>
+                <w:rFonts w:ascii="Times New Roman" w:hAnsi="Times New Roman"/>
+                <w:sz w:val="22"/>
+                <w:szCs w:val="22"/>
+              </w:rPr>
+              <w:t>chức</w:t>
+            </w:r>
+            <w:proofErr w:type="spellEnd"/>
+            <w:r>
+              <w:rPr>
+                <w:rFonts w:ascii="Times New Roman" w:hAnsi="Times New Roman"/>
+                <w:sz w:val="22"/>
+                <w:szCs w:val="22"/>
+              </w:rPr>
+              <w:t xml:space="preserve"> </w:t>
+            </w:r>
+            <w:proofErr w:type="spellStart"/>
+            <w:r>
+              <w:rPr>
+                <w:rFonts w:ascii="Times New Roman" w:hAnsi="Times New Roman"/>
+                <w:sz w:val="22"/>
+                <w:szCs w:val="22"/>
+              </w:rPr>
+              <w:t>vụ</w:t>
+            </w:r>
+            <w:proofErr w:type="spellEnd"/>
+            <w:r>
+              <w:rPr>
+                <w:rFonts w:ascii="Times New Roman" w:hAnsi="Times New Roman"/>
+                <w:sz w:val="22"/>
+                <w:szCs w:val="22"/>
+              </w:rPr>
+              <w:t xml:space="preserve"> </w:t>
+            </w:r>
+            <w:proofErr w:type="spellStart"/>
+            <w:r>
+              <w:rPr>
+                <w:rFonts w:ascii="Times New Roman" w:hAnsi="Times New Roman"/>
+                <w:sz w:val="22"/>
+                <w:szCs w:val="22"/>
+              </w:rPr>
+              <w:t>của</w:t>
+            </w:r>
+            <w:proofErr w:type="spellEnd"/>
+            <w:r>
+              <w:rPr>
+                <w:rFonts w:ascii="Times New Roman" w:hAnsi="Times New Roman"/>
+                <w:sz w:val="22"/>
+                <w:szCs w:val="22"/>
+              </w:rPr>
+              <w:t xml:space="preserve"> </w:t>
+            </w:r>
+            <w:proofErr w:type="spellStart"/>
+            <w:r>
+              <w:rPr>
+                <w:rFonts w:ascii="Times New Roman" w:hAnsi="Times New Roman"/>
+                <w:sz w:val="22"/>
+                <w:szCs w:val="22"/>
+              </w:rPr>
+              <w:t>ng</w:t>
+            </w:r>
+            <w:r>
+              <w:rPr>
+                <w:rFonts w:ascii="Times New Roman" w:hAnsi="Times New Roman" w:hint="eastAsia"/>
+                <w:sz w:val="22"/>
+                <w:szCs w:val="22"/>
+              </w:rPr>
+              <w:t>ư</w:t>
+            </w:r>
+            <w:r>
+              <w:rPr>
+                <w:rFonts w:ascii="Times New Roman" w:hAnsi="Times New Roman"/>
+                <w:sz w:val="22"/>
+                <w:szCs w:val="22"/>
+              </w:rPr>
+              <w:t>ời</w:t>
+            </w:r>
+            <w:proofErr w:type="spellEnd"/>
+            <w:r>
+              <w:rPr>
+                <w:rFonts w:ascii="Times New Roman" w:hAnsi="Times New Roman"/>
+                <w:sz w:val="22"/>
+                <w:szCs w:val="22"/>
+              </w:rPr>
+              <w:t xml:space="preserve"> </w:t>
+            </w:r>
+            <w:proofErr w:type="spellStart"/>
+            <w:r>
+              <w:rPr>
+                <w:rFonts w:ascii="Times New Roman" w:hAnsi="Times New Roman"/>
+                <w:sz w:val="22"/>
+                <w:szCs w:val="22"/>
+              </w:rPr>
+              <w:t>ký</w:t>
+            </w:r>
+            <w:proofErr w:type="spellEnd"/>
+            <w:r>
+              <w:rPr>
+                <w:rFonts w:ascii="Times New Roman" w:hAnsi="Times New Roman"/>
+                <w:sz w:val="22"/>
+                <w:szCs w:val="22"/>
+              </w:rPr>
+              <w:t xml:space="preserve"> (</w:t>
+            </w:r>
+            <w:proofErr w:type="spellStart"/>
+            <w:r>
+              <w:rPr>
+                <w:rFonts w:ascii="Times New Roman" w:hAnsi="Times New Roman"/>
+                <w:sz w:val="22"/>
+                <w:szCs w:val="22"/>
+              </w:rPr>
+              <w:t>chữ</w:t>
+            </w:r>
+            <w:proofErr w:type="spellEnd"/>
+            <w:r>
+              <w:rPr>
+                <w:rFonts w:ascii="Times New Roman" w:hAnsi="Times New Roman"/>
+                <w:sz w:val="22"/>
+                <w:szCs w:val="22"/>
+              </w:rPr>
+              <w:t xml:space="preserve"> </w:t>
+            </w:r>
+            <w:r>
+              <w:rPr>
+                <w:rFonts w:ascii="Times New Roman" w:hAnsi="Times New Roman"/>
+                <w:sz w:val="22"/>
+                <w:szCs w:val="22"/>
+              </w:rPr>
+              <w:t xml:space="preserve">in </w:t>
+            </w:r>
+            <w:proofErr w:type="spellStart"/>
+            <w:r>
+              <w:rPr>
+                <w:rFonts w:ascii="Times New Roman" w:hAnsi="Times New Roman"/>
+                <w:sz w:val="22"/>
+                <w:szCs w:val="22"/>
+              </w:rPr>
+              <w:t>hoa</w:t>
+            </w:r>
+            <w:proofErr w:type="spellEnd"/>
+            <w:r>
+              <w:rPr>
+                <w:rFonts w:ascii="Times New Roman" w:hAnsi="Times New Roman"/>
+                <w:sz w:val="22"/>
+                <w:szCs w:val="22"/>
+              </w:rPr>
+              <w:t>,</w:t>
+            </w:r>
+            <w:r>
+              <w:rPr>
+                <w:rFonts w:ascii="Times New Roman" w:hAnsi="Times New Roman"/>
+                <w:sz w:val="22"/>
+                <w:szCs w:val="22"/>
+              </w:rPr>
+              <w:t xml:space="preserve"> </w:t>
+            </w:r>
+            <w:proofErr w:type="spellStart"/>
+            <w:r>
+              <w:rPr>
+                <w:rFonts w:ascii="Times New Roman" w:hAnsi="Times New Roman"/>
+                <w:sz w:val="22"/>
+                <w:szCs w:val="22"/>
+              </w:rPr>
+              <w:t>đứng</w:t>
+            </w:r>
+            <w:proofErr w:type="spellEnd"/>
+            <w:r>
+              <w:rPr>
+                <w:rFonts w:ascii="Times New Roman" w:hAnsi="Times New Roman"/>
+                <w:sz w:val="22"/>
+                <w:szCs w:val="22"/>
+              </w:rPr>
+              <w:t>,</w:t>
+            </w:r>
+            <w:r>
+              <w:rPr>
+                <w:rFonts w:ascii="Times New Roman" w:hAnsi="Times New Roman"/>
+                <w:sz w:val="22"/>
+                <w:szCs w:val="22"/>
+              </w:rPr>
+              <w:t xml:space="preserve"> </w:t>
+            </w:r>
+            <w:proofErr w:type="spellStart"/>
+            <w:r>
+              <w:rPr>
+                <w:rFonts w:ascii="Times New Roman" w:hAnsi="Times New Roman"/>
+                <w:sz w:val="22"/>
+                <w:szCs w:val="22"/>
+              </w:rPr>
+              <w:t>đậm</w:t>
+            </w:r>
+            <w:proofErr w:type="spellEnd"/>
+            <w:r>
+              <w:rPr>
+                <w:rFonts w:ascii="Times New Roman" w:hAnsi="Times New Roman"/>
+                <w:sz w:val="22"/>
+                <w:szCs w:val="22"/>
+              </w:rPr>
+              <w:t>)</w:t>
+            </w:r>
+            <w:r>
+              <w:rPr>
+                <w:rFonts w:ascii="Times New Roman" w:hAnsi="Times New Roman"/>
+                <w:sz w:val="22"/>
+                <w:szCs w:val="22"/>
+              </w:rPr>
+              <w:t>.</w:t>
+            </w:r>
+          </w:p>
+          <w:p>
+            <w:pPr>
+              <w:pStyle w:val="BodyTextIndent"/>
+              <w:spacing w:after="0"/>
+              <w:ind w:firstLine="0"/>
+              <w:rPr>
+                <w:rFonts w:ascii="Times New Roman" w:hAnsi="Times New Roman"/>
+                <w:b/>
+                <w:sz w:val="22"/>
+                <w:szCs w:val="22"/>
+              </w:rPr>
+            </w:pPr>
+            <w:r>
+              <w:rPr>
+                <w:rFonts w:ascii="Times New Roman" w:hAnsi="Times New Roman"/>
+                <w:sz w:val="22"/>
+                <w:szCs w:val="22"/>
+              </w:rPr>
+              <w:t xml:space="preserve">Trường </w:t>
+            </w:r>
+            <w:proofErr w:type="spellStart"/>
+            <w:r>
+              <w:rPr>
+                <w:rFonts w:ascii="Times New Roman" w:hAnsi="Times New Roman"/>
+                <w:sz w:val="22"/>
+                <w:szCs w:val="22"/>
+              </w:rPr>
+              <w:t>hợp</w:t>
+            </w:r>
+            <w:proofErr w:type="spellEnd"/>
+            <w:r>
+              <w:rPr>
+                <w:rFonts w:ascii="Times New Roman" w:hAnsi="Times New Roman"/>
+                <w:sz w:val="22"/>
+                <w:szCs w:val="22"/>
+              </w:rPr>
+              <w:t xml:space="preserve"> </w:t>
+            </w:r>
+            <w:proofErr w:type="spellStart"/>
+            <w:r>
+              <w:rPr>
+                <w:rFonts w:ascii="Times New Roman" w:hAnsi="Times New Roman"/>
+                <w:sz w:val="22"/>
+                <w:szCs w:val="22"/>
+              </w:rPr>
+              <w:t>cấp</w:t>
+            </w:r>
+            <w:proofErr w:type="spellEnd"/>
+            <w:r>
+              <w:rPr>
+                <w:rFonts w:ascii="Times New Roman" w:hAnsi="Times New Roman"/>
+                <w:sz w:val="22"/>
+                <w:szCs w:val="22"/>
+              </w:rPr>
+              <w:t xml:space="preserve"> </w:t>
+            </w:r>
+            <w:proofErr w:type="spellStart"/>
+            <w:r>
+              <w:rPr>
+                <w:rFonts w:ascii="Times New Roman" w:hAnsi="Times New Roman"/>
+                <w:sz w:val="22"/>
+                <w:szCs w:val="22"/>
+              </w:rPr>
+              <w:t>Phó</w:t>
+            </w:r>
+            <w:proofErr w:type="spellEnd"/>
+            <w:r>
+              <w:rPr>
+                <w:rFonts w:ascii="Times New Roman" w:hAnsi="Times New Roman"/>
+                <w:sz w:val="22"/>
+                <w:szCs w:val="22"/>
+              </w:rPr>
+              <w:t xml:space="preserve"> </w:t>
+            </w:r>
+            <w:proofErr w:type="spellStart"/>
+            <w:r>
+              <w:rPr>
+                <w:rFonts w:ascii="Times New Roman" w:hAnsi="Times New Roman"/>
+                <w:sz w:val="22"/>
+                <w:szCs w:val="22"/>
+              </w:rPr>
+              <w:t>ký</w:t>
+            </w:r>
+            <w:proofErr w:type="spellEnd"/>
+            <w:r>
+              <w:rPr>
+                <w:rFonts w:ascii="Times New Roman" w:hAnsi="Times New Roman"/>
+                <w:sz w:val="22"/>
+                <w:szCs w:val="22"/>
+              </w:rPr>
+              <w:t xml:space="preserve"> </w:t>
+            </w:r>
+            <w:proofErr w:type="spellStart"/>
+            <w:r>
+              <w:rPr>
+                <w:rFonts w:ascii="Times New Roman" w:hAnsi="Times New Roman"/>
+                <w:sz w:val="22"/>
+                <w:szCs w:val="22"/>
+              </w:rPr>
+              <w:t>thay</w:t>
+            </w:r>
+            <w:proofErr w:type="spellEnd"/>
+            <w:r>
+              <w:rPr>
+                <w:rFonts w:ascii="Times New Roman" w:hAnsi="Times New Roman"/>
+                <w:sz w:val="22"/>
+                <w:szCs w:val="22"/>
+              </w:rPr>
+              <w:t xml:space="preserve"> </w:t>
+            </w:r>
+            <w:proofErr w:type="spellStart"/>
+            <w:r>
+              <w:rPr>
+                <w:rFonts w:ascii="Times New Roman" w:hAnsi="Times New Roman"/>
+                <w:sz w:val="22"/>
+                <w:szCs w:val="22"/>
+              </w:rPr>
+              <w:t>cấp</w:t>
+            </w:r>
+            <w:proofErr w:type="spellEnd"/>
+            <w:r>
+              <w:rPr>
+                <w:rFonts w:ascii="Times New Roman" w:hAnsi="Times New Roman"/>
+                <w:sz w:val="22"/>
+                <w:szCs w:val="22"/>
+              </w:rPr>
+              <w:t xml:space="preserve"> </w:t>
+            </w:r>
+            <w:proofErr w:type="spellStart"/>
+            <w:r>
+              <w:rPr>
+                <w:rFonts w:ascii="Times New Roman" w:hAnsi="Times New Roman"/>
+                <w:sz w:val="22"/>
+                <w:szCs w:val="22"/>
+              </w:rPr>
+              <w:t>T</w:t>
+            </w:r>
+            <w:r>
+              <w:rPr>
+                <w:rFonts w:ascii="Times New Roman" w:hAnsi="Times New Roman"/>
+                <w:sz w:val="22"/>
+                <w:szCs w:val="22"/>
+              </w:rPr>
+              <w:t>rưởng</w:t>
+            </w:r>
+            <w:proofErr w:type="spellEnd"/>
+            <w:r>
+              <w:rPr>
+                <w:rFonts w:ascii="Times New Roman" w:hAnsi="Times New Roman"/>
+                <w:sz w:val="22"/>
+                <w:szCs w:val="22"/>
+              </w:rPr>
+              <w:t xml:space="preserve"> </w:t>
+            </w:r>
+            <w:proofErr w:type="spellStart"/>
+            <w:r>
+              <w:rPr>
+                <w:rFonts w:ascii="Times New Roman" w:hAnsi="Times New Roman"/>
+                <w:sz w:val="22"/>
+                <w:szCs w:val="22"/>
+              </w:rPr>
+              <w:t>thì</w:t>
+            </w:r>
+            <w:proofErr w:type="spellEnd"/>
+            <w:r>
+              <w:rPr>
+                <w:rFonts w:ascii="Times New Roman" w:hAnsi="Times New Roman"/>
+                <w:sz w:val="22"/>
+                <w:szCs w:val="22"/>
+              </w:rPr>
+              <w:t xml:space="preserve"> </w:t>
+            </w:r>
+            <w:proofErr w:type="spellStart"/>
+            <w:r>
+              <w:rPr>
+                <w:rFonts w:ascii="Times New Roman" w:hAnsi="Times New Roman"/>
+                <w:sz w:val="22"/>
+                <w:szCs w:val="22"/>
+              </w:rPr>
+              <w:t>ghi</w:t>
+            </w:r>
+            <w:proofErr w:type="spellEnd"/>
+            <w:r>
+              <w:rPr>
+                <w:rFonts w:ascii="Times New Roman" w:hAnsi="Times New Roman"/>
+                <w:sz w:val="22"/>
+                <w:szCs w:val="22"/>
+              </w:rPr>
+              <w:t xml:space="preserve">: </w:t>
+            </w:r>
+            <w:r>
+              <w:rPr>
+                <w:rFonts w:ascii="Times New Roman" w:hAnsi="Times New Roman"/>
+                <w:sz w:val="22"/>
+                <w:szCs w:val="22"/>
+              </w:rPr>
+              <w:t xml:space="preserve">      </w:t>
+            </w:r>
+            <w:r>
+              <w:rPr>
+                <w:rFonts w:ascii="Times New Roman" w:hAnsi="Times New Roman"/>
+                <w:sz w:val="22"/>
+                <w:szCs w:val="22"/>
+              </w:rPr>
+              <w:t xml:space="preserve"> </w:t>
+            </w:r>
+            <w:r>
+              <w:rPr>
+                <w:rFonts w:ascii="Times New Roman" w:hAnsi="Times New Roman"/>
+                <w:b/>
+                <w:sz w:val="22"/>
+                <w:szCs w:val="22"/>
+              </w:rPr>
+              <w:t>KT. GIÁM ĐỐC</w:t>
+            </w:r>
+          </w:p>
+          <w:p>
+            <w:pPr>
+              <w:pStyle w:val="BodyTextIndent"/>
+              <w:spacing w:after="0"/>
+              <w:ind w:firstLine="0"/>
+              <w:rPr>
+                <w:rFonts w:ascii="Times New Roman" w:hAnsi="Times New Roman"/>
+                <w:b/>
+                <w:sz w:val="22"/>
+                <w:szCs w:val="22"/>
+              </w:rPr>
+            </w:pPr>
+            <w:r>
+              <w:rPr>
+                <w:rFonts w:ascii="Times New Roman" w:hAnsi="Times New Roman"/>
+                <w:b/>
+                <w:sz w:val="22"/>
+                <w:szCs w:val="22"/>
+              </w:rPr>
+              <w:t xml:space="preserve">                                                                                     PHÓ GIÁM ĐỐC</w:t>
+            </w:r>
+          </w:p>
+          <w:p>
+            <w:pPr>
+              <w:pStyle w:val="FootnoteText"/>
+              <w:jc w:val="both"/>
+              <w:rPr>
+                <w:sz w:val="22"/>
+                <w:szCs w:val="22"/>
+                <w:lang w:val="en-US"/>
+              </w:rPr>
+            </w:pPr>
+            <w:r>
+              <w:rPr>
+                <w:sz w:val="22"/>
+                <w:szCs w:val="22"/>
+                <w:lang w:val="en-US"/>
+              </w:rPr>
+              <w:t>(</w:t>
+            </w:r>
+            <w:r>
+              <w:rPr>
+                <w:sz w:val="22"/>
+                <w:szCs w:val="22"/>
+                <w:lang w:val="en-US"/>
+              </w:rPr>
+              <w:t>6</w:t>
+            </w:r>
+            <w:r>
+              <w:rPr>
+                <w:sz w:val="22"/>
+                <w:szCs w:val="22"/>
+                <w:lang w:val="en-US"/>
+              </w:rPr>
+              <w:t xml:space="preserve">) </w:t>
+            </w:r>
+            <w:proofErr w:type="spellStart"/>
+            <w:r>
+              <w:rPr>
+                <w:spacing w:val="-2"/>
+                <w:sz w:val="22"/>
+                <w:szCs w:val="22"/>
+                <w:lang w:val="en-US"/>
+              </w:rPr>
+              <w:t>Chữ</w:t>
+            </w:r>
+            <w:proofErr w:type="spellEnd"/>
+            <w:r>
+              <w:rPr>
+                <w:spacing w:val="-2"/>
+                <w:sz w:val="22"/>
+                <w:szCs w:val="22"/>
+                <w:lang w:val="en-US"/>
+              </w:rPr>
+              <w:t xml:space="preserve"> </w:t>
+            </w:r>
+            <w:proofErr w:type="spellStart"/>
+            <w:r>
+              <w:rPr>
+                <w:spacing w:val="-2"/>
+                <w:sz w:val="22"/>
+                <w:szCs w:val="22"/>
+                <w:lang w:val="en-US"/>
+              </w:rPr>
+              <w:t>viết</w:t>
+            </w:r>
+            <w:proofErr w:type="spellEnd"/>
+            <w:r>
+              <w:rPr>
+                <w:spacing w:val="-2"/>
+                <w:sz w:val="22"/>
+                <w:szCs w:val="22"/>
+                <w:lang w:val="en-US"/>
+              </w:rPr>
+              <w:t xml:space="preserve"> </w:t>
+            </w:r>
+            <w:proofErr w:type="spellStart"/>
+            <w:r>
+              <w:rPr>
+                <w:spacing w:val="-2"/>
+                <w:sz w:val="22"/>
+                <w:szCs w:val="22"/>
+                <w:lang w:val="en-US"/>
+              </w:rPr>
+              <w:t>tắt</w:t>
+            </w:r>
+            <w:proofErr w:type="spellEnd"/>
+            <w:r>
+              <w:rPr>
+                <w:spacing w:val="-2"/>
+                <w:sz w:val="22"/>
+                <w:szCs w:val="22"/>
+                <w:lang w:val="en-US"/>
+              </w:rPr>
+              <w:t xml:space="preserve"> </w:t>
+            </w:r>
+            <w:proofErr w:type="spellStart"/>
+            <w:r>
+              <w:rPr>
+                <w:spacing w:val="-2"/>
+                <w:sz w:val="22"/>
+                <w:szCs w:val="22"/>
+                <w:lang w:val="en-US"/>
+              </w:rPr>
+              <w:t>tên</w:t>
+            </w:r>
+            <w:proofErr w:type="spellEnd"/>
+            <w:r>
+              <w:rPr>
+                <w:spacing w:val="-2"/>
+                <w:sz w:val="22"/>
+                <w:szCs w:val="22"/>
+                <w:lang w:val="en-US"/>
+              </w:rPr>
+              <w:t xml:space="preserve"> </w:t>
+            </w:r>
+            <w:proofErr w:type="spellStart"/>
+            <w:r>
+              <w:rPr>
+                <w:rFonts w:hint="eastAsia"/>
+                <w:spacing w:val="-2"/>
+                <w:sz w:val="22"/>
+                <w:szCs w:val="22"/>
+                <w:lang w:val="en-US"/>
+              </w:rPr>
+              <w:t>đơ</w:t>
+            </w:r>
+            <w:r>
+              <w:rPr>
+                <w:spacing w:val="-2"/>
+                <w:sz w:val="22"/>
+                <w:szCs w:val="22"/>
+                <w:lang w:val="en-US"/>
+              </w:rPr>
+              <w:t>n</w:t>
+            </w:r>
+            <w:proofErr w:type="spellEnd"/>
+            <w:r>
+              <w:rPr>
+                <w:spacing w:val="-2"/>
+                <w:sz w:val="22"/>
+                <w:szCs w:val="22"/>
+                <w:lang w:val="en-US"/>
+              </w:rPr>
+              <w:t xml:space="preserve"> </w:t>
+            </w:r>
+            <w:proofErr w:type="spellStart"/>
+            <w:r>
+              <w:rPr>
+                <w:spacing w:val="-2"/>
+                <w:sz w:val="22"/>
+                <w:szCs w:val="22"/>
+                <w:lang w:val="en-US"/>
+              </w:rPr>
+              <w:t>vị</w:t>
+            </w:r>
+            <w:proofErr w:type="spellEnd"/>
+            <w:r>
+              <w:rPr>
+                <w:spacing w:val="-2"/>
+                <w:sz w:val="22"/>
+                <w:szCs w:val="22"/>
+                <w:lang w:val="en-US"/>
+              </w:rPr>
+              <w:t xml:space="preserve"> </w:t>
+            </w:r>
+            <w:proofErr w:type="spellStart"/>
+            <w:r>
+              <w:rPr>
+                <w:spacing w:val="-2"/>
+                <w:sz w:val="22"/>
+                <w:szCs w:val="22"/>
+                <w:lang w:val="en-US"/>
+              </w:rPr>
+              <w:t>chủ</w:t>
+            </w:r>
+            <w:proofErr w:type="spellEnd"/>
+            <w:r>
+              <w:rPr>
+                <w:spacing w:val="-2"/>
+                <w:sz w:val="22"/>
+                <w:szCs w:val="22"/>
+                <w:lang w:val="en-US"/>
+              </w:rPr>
+              <w:t xml:space="preserve"> </w:t>
+            </w:r>
+            <w:proofErr w:type="spellStart"/>
+            <w:r>
+              <w:rPr>
+                <w:spacing w:val="-2"/>
+                <w:sz w:val="22"/>
+                <w:szCs w:val="22"/>
+                <w:lang w:val="en-US"/>
+              </w:rPr>
+              <w:t>trì</w:t>
+            </w:r>
+            <w:proofErr w:type="spellEnd"/>
+            <w:r>
+              <w:rPr>
+                <w:spacing w:val="-2"/>
+                <w:sz w:val="22"/>
+                <w:szCs w:val="22"/>
+                <w:lang w:val="en-US"/>
+              </w:rPr>
+              <w:t xml:space="preserve"> </w:t>
+            </w:r>
+            <w:proofErr w:type="spellStart"/>
+            <w:r>
+              <w:rPr>
+                <w:spacing w:val="-2"/>
+                <w:sz w:val="22"/>
+                <w:szCs w:val="22"/>
+                <w:lang w:val="en-US"/>
+              </w:rPr>
+              <w:t>soạn</w:t>
+            </w:r>
+            <w:proofErr w:type="spellEnd"/>
+            <w:r>
+              <w:rPr>
+                <w:spacing w:val="-2"/>
+                <w:sz w:val="22"/>
+                <w:szCs w:val="22"/>
+                <w:lang w:val="en-US"/>
+              </w:rPr>
+              <w:t xml:space="preserve"> </w:t>
+            </w:r>
+            <w:proofErr w:type="spellStart"/>
+            <w:r>
+              <w:rPr>
+                <w:spacing w:val="-2"/>
+                <w:sz w:val="22"/>
+                <w:szCs w:val="22"/>
+                <w:lang w:val="en-US"/>
+              </w:rPr>
+              <w:t>thảo</w:t>
+            </w:r>
+            <w:proofErr w:type="spellEnd"/>
+            <w:r>
+              <w:rPr>
+                <w:spacing w:val="-2"/>
+                <w:sz w:val="22"/>
+                <w:szCs w:val="22"/>
+                <w:lang w:val="en-US"/>
+              </w:rPr>
+              <w:t xml:space="preserve"> </w:t>
+            </w:r>
+            <w:proofErr w:type="spellStart"/>
+            <w:r>
+              <w:rPr>
+                <w:spacing w:val="-2"/>
+                <w:sz w:val="22"/>
+                <w:szCs w:val="22"/>
+                <w:lang w:val="en-US"/>
+              </w:rPr>
+              <w:t>và</w:t>
+            </w:r>
+            <w:proofErr w:type="spellEnd"/>
+            <w:r>
+              <w:rPr>
+                <w:spacing w:val="-2"/>
+                <w:sz w:val="22"/>
+                <w:szCs w:val="22"/>
+                <w:lang w:val="en-US"/>
+              </w:rPr>
+              <w:t xml:space="preserve"> </w:t>
+            </w:r>
+            <w:proofErr w:type="spellStart"/>
+            <w:r>
+              <w:rPr>
+                <w:spacing w:val="-2"/>
+                <w:sz w:val="22"/>
+                <w:szCs w:val="22"/>
+                <w:lang w:val="en-US"/>
+              </w:rPr>
+              <w:t>số</w:t>
+            </w:r>
+            <w:proofErr w:type="spellEnd"/>
+            <w:r>
+              <w:rPr>
+                <w:spacing w:val="-2"/>
+                <w:sz w:val="22"/>
+                <w:szCs w:val="22"/>
+                <w:lang w:val="en-US"/>
+              </w:rPr>
+              <w:t xml:space="preserve"> </w:t>
+            </w:r>
+            <w:proofErr w:type="spellStart"/>
+            <w:r>
+              <w:rPr>
+                <w:spacing w:val="-2"/>
+                <w:sz w:val="22"/>
+                <w:szCs w:val="22"/>
+                <w:lang w:val="en-US"/>
+              </w:rPr>
+              <w:t>l</w:t>
+            </w:r>
+            <w:r>
+              <w:rPr>
+                <w:rFonts w:hint="eastAsia"/>
+                <w:spacing w:val="-2"/>
+                <w:sz w:val="22"/>
+                <w:szCs w:val="22"/>
+                <w:lang w:val="en-US"/>
+              </w:rPr>
+              <w:t>ư</w:t>
+            </w:r>
+            <w:r>
+              <w:rPr>
+                <w:spacing w:val="-2"/>
+                <w:sz w:val="22"/>
+                <w:szCs w:val="22"/>
+                <w:lang w:val="en-US"/>
+              </w:rPr>
+              <w:t>ợng</w:t>
+            </w:r>
+            <w:proofErr w:type="spellEnd"/>
+            <w:r>
+              <w:rPr>
+                <w:spacing w:val="-2"/>
+                <w:sz w:val="22"/>
+                <w:szCs w:val="22"/>
+                <w:lang w:val="en-US"/>
+              </w:rPr>
+              <w:t xml:space="preserve"> </w:t>
+            </w:r>
+            <w:proofErr w:type="spellStart"/>
+            <w:r>
+              <w:rPr>
+                <w:spacing w:val="-2"/>
+                <w:sz w:val="22"/>
+                <w:szCs w:val="22"/>
+                <w:lang w:val="en-US"/>
+              </w:rPr>
+              <w:t>bản</w:t>
+            </w:r>
+            <w:proofErr w:type="spellEnd"/>
+            <w:r>
+              <w:rPr>
+                <w:spacing w:val="-2"/>
+                <w:sz w:val="22"/>
+                <w:szCs w:val="22"/>
+                <w:lang w:val="en-US"/>
+              </w:rPr>
+              <w:t xml:space="preserve"> </w:t>
+            </w:r>
+            <w:proofErr w:type="spellStart"/>
+            <w:r>
+              <w:rPr>
+                <w:spacing w:val="-2"/>
+                <w:sz w:val="22"/>
+                <w:szCs w:val="22"/>
+                <w:lang w:val="en-US"/>
+              </w:rPr>
+              <w:t>l</w:t>
+            </w:r>
+            <w:r>
+              <w:rPr>
+                <w:rFonts w:hint="eastAsia"/>
+                <w:spacing w:val="-2"/>
+                <w:sz w:val="22"/>
+                <w:szCs w:val="22"/>
+                <w:lang w:val="en-US"/>
+              </w:rPr>
+              <w:t>ư</w:t>
+            </w:r>
+            <w:r>
+              <w:rPr>
+                <w:spacing w:val="-2"/>
+                <w:sz w:val="22"/>
+                <w:szCs w:val="22"/>
+                <w:lang w:val="en-US"/>
+              </w:rPr>
+              <w:t>u</w:t>
+            </w:r>
+            <w:proofErr w:type="spellEnd"/>
+            <w:r>
+              <w:rPr>
+                <w:spacing w:val="-2"/>
+                <w:sz w:val="22"/>
+                <w:szCs w:val="22"/>
+                <w:lang w:val="en-US"/>
+              </w:rPr>
+              <w:t xml:space="preserve"> (</w:t>
+            </w:r>
+            <w:proofErr w:type="spellStart"/>
+            <w:r>
+              <w:rPr>
+                <w:spacing w:val="-2"/>
+                <w:sz w:val="22"/>
+                <w:szCs w:val="22"/>
+                <w:lang w:val="en-US"/>
+              </w:rPr>
+              <w:t>nếu</w:t>
+            </w:r>
+            <w:proofErr w:type="spellEnd"/>
+            <w:r>
+              <w:rPr>
+                <w:spacing w:val="-2"/>
+                <w:sz w:val="22"/>
+                <w:szCs w:val="22"/>
+                <w:lang w:val="en-US"/>
+              </w:rPr>
+              <w:t xml:space="preserve"> </w:t>
+            </w:r>
+            <w:proofErr w:type="spellStart"/>
+            <w:r>
+              <w:rPr>
+                <w:spacing w:val="-2"/>
+                <w:sz w:val="22"/>
+                <w:szCs w:val="22"/>
+                <w:lang w:val="en-US"/>
+              </w:rPr>
+              <w:t>cần</w:t>
+            </w:r>
+            <w:proofErr w:type="spellEnd"/>
+            <w:r>
+              <w:rPr>
+                <w:spacing w:val="-2"/>
+                <w:sz w:val="22"/>
+                <w:szCs w:val="22"/>
+                <w:lang w:val="en-US"/>
+              </w:rPr>
+              <w:t>).</w:t>
+            </w:r>
+          </w:p>
+          <w:p>
+            <w:pPr>
+              <w:pStyle w:val="FootnoteText"/>
+              <w:jc w:val="both"/>
+              <w:rPr>
+                <w:sz w:val="22"/>
+                <w:szCs w:val="22"/>
+                <w:lang w:val="en-US"/>
+              </w:rPr>
+            </w:pPr>
+            <w:r>
+              <w:rPr>
+                <w:sz w:val="22"/>
+                <w:szCs w:val="22"/>
+                <w:lang w:val="en-US"/>
+              </w:rPr>
+              <w:t>(</w:t>
+            </w:r>
+            <w:r>
+              <w:rPr>
+                <w:sz w:val="22"/>
+                <w:szCs w:val="22"/>
+                <w:lang w:val="en-US"/>
+              </w:rPr>
+              <w:t>7</w:t>
+            </w:r>
+            <w:r>
+              <w:rPr>
+                <w:sz w:val="22"/>
+                <w:szCs w:val="22"/>
+                <w:lang w:val="en-US"/>
+              </w:rPr>
+              <w:t xml:space="preserve">) </w:t>
+            </w:r>
+            <w:proofErr w:type="spellStart"/>
+            <w:r>
+              <w:rPr>
+                <w:sz w:val="22"/>
+                <w:szCs w:val="22"/>
+                <w:lang w:val="en-US"/>
+              </w:rPr>
+              <w:t>Ký</w:t>
+            </w:r>
+            <w:proofErr w:type="spellEnd"/>
+            <w:r>
+              <w:rPr>
+                <w:sz w:val="22"/>
+                <w:szCs w:val="22"/>
+                <w:lang w:val="en-US"/>
+              </w:rPr>
+              <w:t xml:space="preserve"> </w:t>
+            </w:r>
+            <w:proofErr w:type="spellStart"/>
+            <w:r>
+              <w:rPr>
+                <w:sz w:val="22"/>
+                <w:szCs w:val="22"/>
+                <w:lang w:val="en-US"/>
+              </w:rPr>
+              <w:t>hiệu</w:t>
+            </w:r>
+            <w:proofErr w:type="spellEnd"/>
+            <w:r>
+              <w:rPr>
+                <w:sz w:val="22"/>
+                <w:szCs w:val="22"/>
+                <w:lang w:val="en-US"/>
+              </w:rPr>
+              <w:t xml:space="preserve"> </w:t>
+            </w:r>
+            <w:proofErr w:type="spellStart"/>
+            <w:r>
+              <w:rPr>
+                <w:sz w:val="22"/>
+                <w:szCs w:val="22"/>
+                <w:lang w:val="en-US"/>
+              </w:rPr>
+              <w:t>của</w:t>
+            </w:r>
+            <w:proofErr w:type="spellEnd"/>
+            <w:r>
+              <w:rPr>
+                <w:sz w:val="22"/>
+                <w:szCs w:val="22"/>
+                <w:lang w:val="en-US"/>
+              </w:rPr>
+              <w:t xml:space="preserve"> </w:t>
+            </w:r>
+            <w:proofErr w:type="spellStart"/>
+            <w:r>
+              <w:rPr>
+                <w:sz w:val="22"/>
+                <w:szCs w:val="22"/>
+                <w:lang w:val="en-US"/>
+              </w:rPr>
+              <w:t>ng</w:t>
+            </w:r>
+            <w:r>
+              <w:rPr>
+                <w:rFonts w:hint="eastAsia"/>
+                <w:sz w:val="22"/>
+                <w:szCs w:val="22"/>
+                <w:lang w:val="en-US"/>
+              </w:rPr>
+              <w:t>ư</w:t>
+            </w:r>
+            <w:r>
+              <w:rPr>
+                <w:sz w:val="22"/>
+                <w:szCs w:val="22"/>
+                <w:lang w:val="en-US"/>
+              </w:rPr>
+              <w:t>ời</w:t>
+            </w:r>
+            <w:proofErr w:type="spellEnd"/>
+            <w:r>
+              <w:rPr>
+                <w:sz w:val="22"/>
+                <w:szCs w:val="22"/>
+                <w:lang w:val="en-US"/>
+              </w:rPr>
+              <w:t xml:space="preserve"> </w:t>
+            </w:r>
+            <w:proofErr w:type="spellStart"/>
+            <w:r>
+              <w:rPr>
+                <w:sz w:val="22"/>
+                <w:szCs w:val="22"/>
+                <w:lang w:val="en-US"/>
+              </w:rPr>
+              <w:t>soạn</w:t>
+            </w:r>
+            <w:proofErr w:type="spellEnd"/>
+            <w:r>
+              <w:rPr>
+                <w:sz w:val="22"/>
+                <w:szCs w:val="22"/>
+                <w:lang w:val="en-US"/>
+              </w:rPr>
+              <w:t xml:space="preserve"> </w:t>
+            </w:r>
+            <w:proofErr w:type="spellStart"/>
+            <w:r>
+              <w:rPr>
+                <w:sz w:val="22"/>
+                <w:szCs w:val="22"/>
+                <w:lang w:val="en-US"/>
+              </w:rPr>
+              <w:t>thảo</w:t>
+            </w:r>
+            <w:proofErr w:type="spellEnd"/>
+            <w:r>
+              <w:rPr>
+                <w:sz w:val="22"/>
+                <w:szCs w:val="22"/>
+                <w:lang w:val="en-US"/>
+              </w:rPr>
+              <w:t xml:space="preserve"> </w:t>
+            </w:r>
+            <w:proofErr w:type="spellStart"/>
+            <w:r>
+              <w:rPr>
+                <w:sz w:val="22"/>
+                <w:szCs w:val="22"/>
+                <w:lang w:val="en-US"/>
+              </w:rPr>
+              <w:t>và</w:t>
+            </w:r>
+            <w:proofErr w:type="spellEnd"/>
+            <w:r>
+              <w:rPr>
+                <w:sz w:val="22"/>
+                <w:szCs w:val="22"/>
+                <w:lang w:val="en-US"/>
+              </w:rPr>
+              <w:t xml:space="preserve"> </w:t>
+            </w:r>
+            <w:proofErr w:type="spellStart"/>
+            <w:r>
+              <w:rPr>
+                <w:sz w:val="22"/>
+                <w:szCs w:val="22"/>
+                <w:lang w:val="en-US"/>
+              </w:rPr>
+              <w:t>số</w:t>
+            </w:r>
+            <w:proofErr w:type="spellEnd"/>
+            <w:r>
+              <w:rPr>
+                <w:sz w:val="22"/>
+                <w:szCs w:val="22"/>
+                <w:lang w:val="en-US"/>
+              </w:rPr>
+              <w:t xml:space="preserve"> </w:t>
+            </w:r>
+            <w:proofErr w:type="spellStart"/>
+            <w:r>
+              <w:rPr>
+                <w:sz w:val="22"/>
+                <w:szCs w:val="22"/>
+                <w:lang w:val="en-US"/>
+              </w:rPr>
+              <w:t>l</w:t>
+            </w:r>
+            <w:r>
+              <w:rPr>
+                <w:rFonts w:hint="eastAsia"/>
+                <w:sz w:val="22"/>
+                <w:szCs w:val="22"/>
+                <w:lang w:val="en-US"/>
+              </w:rPr>
+              <w:t>ư</w:t>
+            </w:r>
+            <w:r>
+              <w:rPr>
+                <w:sz w:val="22"/>
+                <w:szCs w:val="22"/>
+                <w:lang w:val="en-US"/>
+              </w:rPr>
+              <w:t>ợng</w:t>
+            </w:r>
+            <w:proofErr w:type="spellEnd"/>
+            <w:r>
+              <w:rPr>
+                <w:sz w:val="22"/>
+                <w:szCs w:val="22"/>
+                <w:lang w:val="en-US"/>
+              </w:rPr>
+              <w:t xml:space="preserve"> </w:t>
+            </w:r>
+            <w:proofErr w:type="spellStart"/>
+            <w:r>
+              <w:rPr>
+                <w:sz w:val="22"/>
+                <w:szCs w:val="22"/>
+                <w:lang w:val="en-US"/>
+              </w:rPr>
+              <w:t>bản</w:t>
+            </w:r>
+            <w:proofErr w:type="spellEnd"/>
+            <w:r>
+              <w:rPr>
+                <w:sz w:val="22"/>
+                <w:szCs w:val="22"/>
+                <w:lang w:val="en-US"/>
+              </w:rPr>
+              <w:t xml:space="preserve"> </w:t>
+            </w:r>
+            <w:proofErr w:type="spellStart"/>
+            <w:r>
+              <w:rPr>
+                <w:sz w:val="22"/>
+                <w:szCs w:val="22"/>
+                <w:lang w:val="en-US"/>
+              </w:rPr>
+              <w:t>phát</w:t>
+            </w:r>
+            <w:proofErr w:type="spellEnd"/>
+            <w:r>
+              <w:rPr>
+                <w:sz w:val="22"/>
+                <w:szCs w:val="22"/>
+                <w:lang w:val="en-US"/>
+              </w:rPr>
+              <w:t xml:space="preserve"> </w:t>
+            </w:r>
+            <w:proofErr w:type="spellStart"/>
+            <w:r>
+              <w:rPr>
+                <w:sz w:val="22"/>
+                <w:szCs w:val="22"/>
+                <w:lang w:val="en-US"/>
+              </w:rPr>
+              <w:t>hành</w:t>
+            </w:r>
+            <w:proofErr w:type="spellEnd"/>
+            <w:r>
+              <w:rPr>
+                <w:sz w:val="22"/>
+                <w:szCs w:val="22"/>
+                <w:lang w:val="en-US"/>
+              </w:rPr>
+              <w:t>.</w:t>
+            </w:r>
+          </w:p>
+          <w:p>
+            <w:pPr>
+              <w:pStyle w:val="FootnoteText"/>
+              <w:jc w:val="both"/>
+              <w:rPr>
+                <w:sz w:val="22"/>
+                <w:szCs w:val="22"/>
+              </w:rPr>
+            </w:pPr>
+            <w:r>
+              <w:rPr>
+                <w:sz w:val="22"/>
+                <w:szCs w:val="22"/>
+              </w:rPr>
+              <w:t>(</w:t>
+            </w:r>
+            <w:r>
+              <w:rPr>
+                <w:sz w:val="22"/>
+                <w:szCs w:val="22"/>
+              </w:rPr>
+              <w:t>8</w:t>
+            </w:r>
+            <w:r>
+              <w:rPr>
+                <w:sz w:val="22"/>
+                <w:szCs w:val="22"/>
+              </w:rPr>
+              <w:t xml:space="preserve">) </w:t>
+            </w:r>
+            <w:proofErr w:type="spellStart"/>
+            <w:r>
+              <w:rPr>
+                <w:sz w:val="22"/>
+                <w:szCs w:val="22"/>
+              </w:rPr>
+              <w:t>Ghi</w:t>
+            </w:r>
+            <w:proofErr w:type="spellEnd"/>
+            <w:r>
+              <w:rPr>
+                <w:sz w:val="22"/>
+                <w:szCs w:val="22"/>
+              </w:rPr>
+              <w:t xml:space="preserve"> </w:t>
+            </w:r>
+            <w:proofErr w:type="spellStart"/>
+            <w:r>
+              <w:rPr>
+                <w:sz w:val="22"/>
+                <w:szCs w:val="22"/>
+              </w:rPr>
+              <w:t>số</w:t>
+            </w:r>
+            <w:proofErr w:type="spellEnd"/>
+            <w:r>
+              <w:rPr>
+                <w:sz w:val="22"/>
+                <w:szCs w:val="22"/>
+              </w:rPr>
+              <w:t xml:space="preserve"> </w:t>
+            </w:r>
+            <w:proofErr w:type="spellStart"/>
+            <w:r>
+              <w:rPr>
+                <w:sz w:val="22"/>
+                <w:szCs w:val="22"/>
+              </w:rPr>
+              <w:t>eOffice</w:t>
+            </w:r>
+            <w:proofErr w:type="spellEnd"/>
+            <w:r>
+              <w:rPr>
+                <w:sz w:val="22"/>
+                <w:szCs w:val="22"/>
+              </w:rPr>
+              <w:t xml:space="preserve">  </w:t>
+            </w:r>
+          </w:p>
+          <w:p>
+            <w:pPr>
+              <w:pStyle w:val="FootnoteText"/>
+              <w:jc w:val="both"/>
+              <w:rPr>
+                <w:sz w:val="22"/>
+                <w:szCs w:val="22"/>
+              </w:rPr>
+            </w:pPr>
+            <w:r>
+              <w:rPr>
+                <w:sz w:val="22"/>
+                <w:szCs w:val="22"/>
+              </w:rPr>
+              <w:t xml:space="preserve"> - </w:t>
+            </w:r>
+            <w:r>
+              <w:rPr>
+                <w:rFonts w:eastAsiaTheme="minorHAnsi"/>
+                <w:b/>
+                <w:bCs/>
+                <w:sz w:val="22"/>
+                <w:szCs w:val="22"/>
+                <w:lang w:val="en-US"/>
+              </w:rPr>
+              <w:t>VBKS</w:t>
+            </w:r>
+            <w:r>
+              <w:rPr>
+                <w:rFonts w:eastAsiaTheme="minorHAnsi"/>
+                <w:sz w:val="22"/>
+                <w:szCs w:val="22"/>
+                <w:lang w:val="en-US"/>
+              </w:rPr>
+              <w:t xml:space="preserve"> </w:t>
+            </w:r>
+            <w:r>
+              <w:rPr>
+                <w:rFonts w:eastAsiaTheme="minorHAnsi"/>
+                <w:sz w:val="22"/>
+                <w:szCs w:val="22"/>
+                <w:lang w:val="en-US"/>
+              </w:rPr>
+              <w:t xml:space="preserve">(Văn </w:t>
+            </w:r>
+            <w:proofErr w:type="spellStart"/>
+            <w:r>
+              <w:rPr>
+                <w:rFonts w:eastAsiaTheme="minorHAnsi"/>
+                <w:sz w:val="22"/>
+                <w:szCs w:val="22"/>
+                <w:lang w:val="en-US"/>
+              </w:rPr>
+              <w:t>bản</w:t>
+            </w:r>
+            <w:proofErr w:type="spellEnd"/>
+            <w:r>
+              <w:rPr>
+                <w:rFonts w:eastAsiaTheme="minorHAnsi"/>
+                <w:sz w:val="22"/>
+                <w:szCs w:val="22"/>
+                <w:lang w:val="en-US"/>
+              </w:rPr>
+              <w:t xml:space="preserve"> </w:t>
+            </w:r>
+            <w:proofErr w:type="spellStart"/>
+            <w:r>
+              <w:rPr>
+                <w:rFonts w:eastAsiaTheme="minorHAnsi"/>
+                <w:sz w:val="22"/>
+                <w:szCs w:val="22"/>
+                <w:lang w:val="en-US"/>
+              </w:rPr>
+              <w:t>ký</w:t>
+            </w:r>
+            <w:proofErr w:type="spellEnd"/>
+            <w:r>
+              <w:rPr>
+                <w:rFonts w:eastAsiaTheme="minorHAnsi"/>
+                <w:sz w:val="22"/>
+                <w:szCs w:val="22"/>
+                <w:lang w:val="en-US"/>
+              </w:rPr>
+              <w:t xml:space="preserve"> </w:t>
+            </w:r>
+            <w:proofErr w:type="spellStart"/>
+            <w:r>
+              <w:rPr>
+                <w:rFonts w:eastAsiaTheme="minorHAnsi"/>
+                <w:sz w:val="22"/>
+                <w:szCs w:val="22"/>
+                <w:lang w:val="en-US"/>
+              </w:rPr>
+              <w:t>số</w:t>
+            </w:r>
+            <w:proofErr w:type="spellEnd"/>
+            <w:r>
+              <w:rPr>
+                <w:rFonts w:eastAsiaTheme="minorHAnsi"/>
+                <w:sz w:val="22"/>
+                <w:szCs w:val="22"/>
+                <w:lang w:val="en-US"/>
+              </w:rPr>
+              <w:t xml:space="preserve">): </w:t>
+            </w:r>
+            <w:proofErr w:type="spellStart"/>
+            <w:r>
+              <w:rPr>
+                <w:rFonts w:eastAsiaTheme="minorHAnsi"/>
+                <w:sz w:val="22"/>
+                <w:szCs w:val="22"/>
+                <w:lang w:val="en-US"/>
+              </w:rPr>
+              <w:t>Là</w:t>
+            </w:r>
+            <w:proofErr w:type="spellEnd"/>
+            <w:r>
+              <w:rPr>
+                <w:rFonts w:eastAsiaTheme="minorHAnsi"/>
+                <w:sz w:val="22"/>
+                <w:szCs w:val="22"/>
+                <w:lang w:val="en-US"/>
+              </w:rPr>
+              <w:t xml:space="preserve"> </w:t>
+            </w:r>
+            <w:proofErr w:type="spellStart"/>
+            <w:r>
+              <w:rPr>
+                <w:rFonts w:eastAsiaTheme="minorHAnsi"/>
+                <w:sz w:val="22"/>
+                <w:szCs w:val="22"/>
+                <w:lang w:val="en-US"/>
+              </w:rPr>
+              <w:t>văn</w:t>
+            </w:r>
+            <w:proofErr w:type="spellEnd"/>
+            <w:r>
+              <w:rPr>
+                <w:rFonts w:eastAsiaTheme="minorHAnsi"/>
+                <w:sz w:val="22"/>
+                <w:szCs w:val="22"/>
+                <w:lang w:val="en-US"/>
+              </w:rPr>
+              <w:t xml:space="preserve"> </w:t>
+            </w:r>
+            <w:proofErr w:type="spellStart"/>
+            <w:r>
+              <w:rPr>
+                <w:rFonts w:eastAsiaTheme="minorHAnsi"/>
+                <w:sz w:val="22"/>
+                <w:szCs w:val="22"/>
+                <w:lang w:val="en-US"/>
+              </w:rPr>
+              <w:t>bản</w:t>
+            </w:r>
+            <w:proofErr w:type="spellEnd"/>
+            <w:r>
+              <w:rPr>
+                <w:rFonts w:eastAsiaTheme="minorHAnsi"/>
+                <w:sz w:val="22"/>
+                <w:szCs w:val="22"/>
+                <w:lang w:val="en-US"/>
+              </w:rPr>
+              <w:t xml:space="preserve"> </w:t>
+            </w:r>
+            <w:proofErr w:type="spellStart"/>
+            <w:r>
+              <w:rPr>
+                <w:rFonts w:eastAsiaTheme="minorHAnsi"/>
+                <w:sz w:val="22"/>
+                <w:szCs w:val="22"/>
+                <w:lang w:val="en-US"/>
+              </w:rPr>
+              <w:t>các</w:t>
+            </w:r>
+            <w:proofErr w:type="spellEnd"/>
+            <w:r>
+              <w:rPr>
+                <w:rFonts w:eastAsiaTheme="minorHAnsi"/>
+                <w:sz w:val="22"/>
+                <w:szCs w:val="22"/>
+                <w:lang w:val="en-US"/>
+              </w:rPr>
+              <w:t xml:space="preserve"> </w:t>
+            </w:r>
+            <w:proofErr w:type="spellStart"/>
+            <w:r>
+              <w:rPr>
+                <w:rFonts w:eastAsiaTheme="minorHAnsi"/>
+                <w:sz w:val="22"/>
+                <w:szCs w:val="22"/>
+                <w:lang w:val="en-US"/>
+              </w:rPr>
+              <w:t>Phòng</w:t>
+            </w:r>
+            <w:proofErr w:type="spellEnd"/>
+            <w:r>
+              <w:rPr>
+                <w:rFonts w:eastAsiaTheme="minorHAnsi"/>
+                <w:sz w:val="22"/>
+                <w:szCs w:val="22"/>
+                <w:lang w:val="en-US"/>
+              </w:rPr>
+              <w:t xml:space="preserve"> </w:t>
+            </w:r>
+            <w:proofErr w:type="spellStart"/>
+            <w:r>
+              <w:rPr>
+                <w:rFonts w:eastAsiaTheme="minorHAnsi"/>
+                <w:sz w:val="22"/>
+                <w:szCs w:val="22"/>
+                <w:lang w:val="en-US"/>
+              </w:rPr>
+              <w:t>chức</w:t>
+            </w:r>
+            <w:proofErr w:type="spellEnd"/>
+            <w:r>
+              <w:rPr>
+                <w:rFonts w:eastAsiaTheme="minorHAnsi"/>
+                <w:sz w:val="22"/>
+                <w:szCs w:val="22"/>
+                <w:lang w:val="en-US"/>
+              </w:rPr>
+              <w:t xml:space="preserve"> </w:t>
+            </w:r>
+            <w:proofErr w:type="spellStart"/>
+            <w:r>
+              <w:rPr>
+                <w:rFonts w:eastAsiaTheme="minorHAnsi"/>
+                <w:sz w:val="22"/>
+                <w:szCs w:val="22"/>
+                <w:lang w:val="en-US"/>
+              </w:rPr>
+              <w:t>năng</w:t>
+            </w:r>
+            <w:proofErr w:type="spellEnd"/>
+            <w:r>
+              <w:rPr>
+                <w:rFonts w:eastAsiaTheme="minorHAnsi"/>
+                <w:sz w:val="22"/>
+                <w:szCs w:val="22"/>
+                <w:lang w:val="en-US"/>
+              </w:rPr>
+              <w:t xml:space="preserve"> </w:t>
+            </w:r>
+            <w:proofErr w:type="spellStart"/>
+            <w:r>
+              <w:rPr>
+                <w:rFonts w:eastAsiaTheme="minorHAnsi"/>
+                <w:sz w:val="22"/>
+                <w:szCs w:val="22"/>
+                <w:lang w:val="en-US"/>
+              </w:rPr>
+              <w:t>được</w:t>
+            </w:r>
+            <w:proofErr w:type="spellEnd"/>
+            <w:r>
+              <w:rPr>
+                <w:rFonts w:eastAsiaTheme="minorHAnsi"/>
+                <w:sz w:val="22"/>
+                <w:szCs w:val="22"/>
+                <w:lang w:val="en-US"/>
+              </w:rPr>
+              <w:t xml:space="preserve"> </w:t>
+            </w:r>
+            <w:proofErr w:type="spellStart"/>
+            <w:r>
+              <w:rPr>
+                <w:rFonts w:eastAsiaTheme="minorHAnsi"/>
+                <w:sz w:val="22"/>
+                <w:szCs w:val="22"/>
+                <w:lang w:val="en-US"/>
+              </w:rPr>
+              <w:t>phân</w:t>
+            </w:r>
+            <w:proofErr w:type="spellEnd"/>
+            <w:r>
+              <w:rPr>
+                <w:rFonts w:eastAsiaTheme="minorHAnsi"/>
+                <w:sz w:val="22"/>
+                <w:szCs w:val="22"/>
+                <w:lang w:val="en-US"/>
+              </w:rPr>
+              <w:t xml:space="preserve"> </w:t>
+            </w:r>
+            <w:proofErr w:type="spellStart"/>
+            <w:r>
+              <w:rPr>
+                <w:rFonts w:eastAsiaTheme="minorHAnsi"/>
+                <w:sz w:val="22"/>
+                <w:szCs w:val="22"/>
+                <w:lang w:val="en-US"/>
+              </w:rPr>
+              <w:t>công</w:t>
+            </w:r>
+            <w:proofErr w:type="spellEnd"/>
+            <w:r>
+              <w:rPr>
+                <w:rFonts w:eastAsiaTheme="minorHAnsi"/>
+                <w:sz w:val="22"/>
+                <w:szCs w:val="22"/>
+                <w:lang w:val="en-US"/>
+              </w:rPr>
+              <w:t xml:space="preserve"> </w:t>
+            </w:r>
+            <w:proofErr w:type="spellStart"/>
+            <w:r>
+              <w:rPr>
+                <w:rFonts w:eastAsiaTheme="minorHAnsi"/>
+                <w:sz w:val="22"/>
+                <w:szCs w:val="22"/>
+                <w:lang w:val="en-US"/>
+              </w:rPr>
+              <w:t>soạn</w:t>
+            </w:r>
+            <w:proofErr w:type="spellEnd"/>
+            <w:r>
+              <w:rPr>
+                <w:rFonts w:eastAsiaTheme="minorHAnsi"/>
+                <w:sz w:val="22"/>
+                <w:szCs w:val="22"/>
+                <w:lang w:val="en-US"/>
+              </w:rPr>
+              <w:t xml:space="preserve"> </w:t>
+            </w:r>
+            <w:proofErr w:type="spellStart"/>
+            <w:r>
+              <w:rPr>
+                <w:rFonts w:eastAsiaTheme="minorHAnsi"/>
+                <w:sz w:val="22"/>
+                <w:szCs w:val="22"/>
+                <w:lang w:val="en-US"/>
+              </w:rPr>
+              <w:t>thảo</w:t>
+            </w:r>
+            <w:proofErr w:type="spellEnd"/>
+            <w:r>
+              <w:rPr>
+                <w:rFonts w:eastAsiaTheme="minorHAnsi"/>
+                <w:sz w:val="22"/>
+                <w:szCs w:val="22"/>
+                <w:lang w:val="en-US"/>
+              </w:rPr>
+              <w:t xml:space="preserve"> </w:t>
+            </w:r>
+            <w:proofErr w:type="spellStart"/>
+            <w:r>
+              <w:rPr>
+                <w:rFonts w:eastAsiaTheme="minorHAnsi"/>
+                <w:sz w:val="22"/>
+                <w:szCs w:val="22"/>
+                <w:lang w:val="en-US"/>
+              </w:rPr>
+              <w:t>trình</w:t>
+            </w:r>
+            <w:proofErr w:type="spellEnd"/>
+            <w:r>
+              <w:rPr>
+                <w:rFonts w:eastAsiaTheme="minorHAnsi"/>
+                <w:sz w:val="22"/>
+                <w:szCs w:val="22"/>
+                <w:lang w:val="en-US"/>
+              </w:rPr>
+              <w:t xml:space="preserve"> </w:t>
+            </w:r>
+            <w:proofErr w:type="spellStart"/>
+            <w:r>
+              <w:rPr>
+                <w:rFonts w:eastAsiaTheme="minorHAnsi"/>
+                <w:sz w:val="22"/>
+                <w:szCs w:val="22"/>
+                <w:lang w:val="en-US"/>
+              </w:rPr>
+              <w:t>Lãnh</w:t>
+            </w:r>
+            <w:proofErr w:type="spellEnd"/>
+            <w:r>
+              <w:rPr>
+                <w:rFonts w:eastAsiaTheme="minorHAnsi"/>
+                <w:sz w:val="22"/>
+                <w:szCs w:val="22"/>
+                <w:lang w:val="en-US"/>
+              </w:rPr>
+              <w:t xml:space="preserve"> </w:t>
+            </w:r>
+            <w:proofErr w:type="spellStart"/>
+            <w:r>
+              <w:rPr>
+                <w:rFonts w:eastAsiaTheme="minorHAnsi"/>
+                <w:sz w:val="22"/>
+                <w:szCs w:val="22"/>
+                <w:lang w:val="en-US"/>
+              </w:rPr>
+              <w:t>đạo</w:t>
+            </w:r>
+            <w:proofErr w:type="spellEnd"/>
+            <w:r>
+              <w:rPr>
+                <w:rFonts w:eastAsiaTheme="minorHAnsi"/>
+                <w:sz w:val="22"/>
+                <w:szCs w:val="22"/>
+                <w:lang w:val="en-US"/>
+              </w:rPr>
+              <w:t xml:space="preserve"> </w:t>
+            </w:r>
+            <w:proofErr w:type="spellStart"/>
+            <w:r>
+              <w:rPr>
+                <w:rFonts w:eastAsiaTheme="minorHAnsi"/>
+                <w:sz w:val="22"/>
+                <w:szCs w:val="22"/>
+                <w:lang w:val="en-US"/>
+              </w:rPr>
+              <w:t>ký</w:t>
+            </w:r>
+            <w:proofErr w:type="spellEnd"/>
+            <w:r>
+              <w:rPr>
+                <w:rFonts w:eastAsiaTheme="minorHAnsi"/>
+                <w:sz w:val="22"/>
+                <w:szCs w:val="22"/>
+                <w:lang w:val="en-US"/>
+              </w:rPr>
+              <w:t xml:space="preserve"> </w:t>
+            </w:r>
+            <w:proofErr w:type="spellStart"/>
+            <w:r>
+              <w:rPr>
+                <w:rFonts w:eastAsiaTheme="minorHAnsi"/>
+                <w:sz w:val="22"/>
+                <w:szCs w:val="22"/>
+                <w:lang w:val="en-US"/>
+              </w:rPr>
+              <w:t>số</w:t>
+            </w:r>
+            <w:proofErr w:type="spellEnd"/>
+            <w:r>
+              <w:rPr>
+                <w:rFonts w:eastAsiaTheme="minorHAnsi"/>
+                <w:sz w:val="22"/>
+                <w:szCs w:val="22"/>
+                <w:lang w:val="en-US"/>
+              </w:rPr>
+              <w:t xml:space="preserve"> </w:t>
+            </w:r>
+            <w:proofErr w:type="spellStart"/>
+            <w:r>
+              <w:rPr>
+                <w:rFonts w:eastAsiaTheme="minorHAnsi"/>
+                <w:sz w:val="22"/>
+                <w:szCs w:val="22"/>
+                <w:lang w:val="en-US"/>
+              </w:rPr>
+              <w:t>và</w:t>
+            </w:r>
+            <w:proofErr w:type="spellEnd"/>
+            <w:r>
+              <w:rPr>
+                <w:rFonts w:eastAsiaTheme="minorHAnsi"/>
+                <w:sz w:val="22"/>
+                <w:szCs w:val="22"/>
+                <w:lang w:val="en-US"/>
+              </w:rPr>
+              <w:t xml:space="preserve"> </w:t>
+            </w:r>
+            <w:proofErr w:type="spellStart"/>
+            <w:r>
+              <w:rPr>
+                <w:rFonts w:eastAsiaTheme="minorHAnsi"/>
+                <w:sz w:val="22"/>
+                <w:szCs w:val="22"/>
+                <w:lang w:val="en-US"/>
+              </w:rPr>
+              <w:t>phát</w:t>
+            </w:r>
+            <w:proofErr w:type="spellEnd"/>
+            <w:r>
+              <w:rPr>
+                <w:rFonts w:eastAsiaTheme="minorHAnsi"/>
+                <w:sz w:val="22"/>
+                <w:szCs w:val="22"/>
+                <w:lang w:val="en-US"/>
+              </w:rPr>
+              <w:t xml:space="preserve"> </w:t>
+            </w:r>
+            <w:proofErr w:type="spellStart"/>
+            <w:r>
+              <w:rPr>
+                <w:rFonts w:eastAsiaTheme="minorHAnsi"/>
+                <w:sz w:val="22"/>
+                <w:szCs w:val="22"/>
+                <w:lang w:val="en-US"/>
+              </w:rPr>
+              <w:t>hành</w:t>
+            </w:r>
+            <w:proofErr w:type="spellEnd"/>
+            <w:r>
+              <w:rPr>
+                <w:rFonts w:eastAsiaTheme="minorHAnsi"/>
+                <w:sz w:val="22"/>
+                <w:szCs w:val="22"/>
+                <w:lang w:val="en-US"/>
+              </w:rPr>
+              <w:t xml:space="preserve"> </w:t>
+            </w:r>
+            <w:proofErr w:type="spellStart"/>
+            <w:r>
+              <w:rPr>
+                <w:rFonts w:eastAsiaTheme="minorHAnsi"/>
+                <w:sz w:val="22"/>
+                <w:szCs w:val="22"/>
+                <w:lang w:val="en-US"/>
+              </w:rPr>
+              <w:t>trên</w:t>
+            </w:r>
+            <w:proofErr w:type="spellEnd"/>
+            <w:r>
+              <w:rPr>
+                <w:rFonts w:eastAsiaTheme="minorHAnsi"/>
+                <w:sz w:val="22"/>
+                <w:szCs w:val="22"/>
+                <w:lang w:val="en-US"/>
+              </w:rPr>
+              <w:t xml:space="preserve"> </w:t>
+            </w:r>
+            <w:proofErr w:type="spellStart"/>
+            <w:r>
+              <w:rPr>
+                <w:rFonts w:eastAsiaTheme="minorHAnsi"/>
+                <w:sz w:val="22"/>
+                <w:szCs w:val="22"/>
+                <w:lang w:val="en-US"/>
+              </w:rPr>
+              <w:t>eOffice</w:t>
+            </w:r>
+            <w:proofErr w:type="spellEnd"/>
+            <w:r>
+              <w:rPr>
+                <w:rFonts w:eastAsiaTheme="minorHAnsi"/>
+                <w:sz w:val="22"/>
+                <w:szCs w:val="22"/>
+                <w:lang w:val="en-US"/>
+              </w:rPr>
+              <w:t xml:space="preserve"> </w:t>
+            </w:r>
+            <w:proofErr w:type="spellStart"/>
+            <w:r>
+              <w:rPr>
+                <w:rFonts w:eastAsiaTheme="minorHAnsi"/>
+                <w:sz w:val="22"/>
+                <w:szCs w:val="22"/>
+                <w:lang w:val="en-US"/>
+              </w:rPr>
+              <w:t>gửi</w:t>
+            </w:r>
+            <w:proofErr w:type="spellEnd"/>
+            <w:r>
+              <w:rPr>
+                <w:rFonts w:eastAsiaTheme="minorHAnsi"/>
+                <w:sz w:val="22"/>
+                <w:szCs w:val="22"/>
+                <w:lang w:val="en-US"/>
+              </w:rPr>
+              <w:t xml:space="preserve"> </w:t>
+            </w:r>
+            <w:proofErr w:type="spellStart"/>
+            <w:r>
+              <w:rPr>
+                <w:rFonts w:eastAsiaTheme="minorHAnsi"/>
+                <w:sz w:val="22"/>
+                <w:szCs w:val="22"/>
+                <w:lang w:val="en-US"/>
+              </w:rPr>
+              <w:t>đến</w:t>
+            </w:r>
+            <w:proofErr w:type="spellEnd"/>
+            <w:r>
+              <w:rPr>
+                <w:rFonts w:eastAsiaTheme="minorHAnsi"/>
+                <w:sz w:val="22"/>
+                <w:szCs w:val="22"/>
+                <w:lang w:val="en-US"/>
+              </w:rPr>
+              <w:t xml:space="preserve"> </w:t>
+            </w:r>
+            <w:proofErr w:type="spellStart"/>
+            <w:r>
+              <w:rPr>
+                <w:rFonts w:eastAsiaTheme="minorHAnsi"/>
+                <w:sz w:val="22"/>
+                <w:szCs w:val="22"/>
+                <w:lang w:val="en-US"/>
+              </w:rPr>
+              <w:t>người</w:t>
+            </w:r>
+            <w:proofErr w:type="spellEnd"/>
+            <w:r>
+              <w:rPr>
+                <w:rFonts w:eastAsiaTheme="minorHAnsi"/>
+                <w:sz w:val="22"/>
+                <w:szCs w:val="22"/>
+                <w:lang w:val="en-US"/>
+              </w:rPr>
+              <w:t xml:space="preserve"> </w:t>
+            </w:r>
+            <w:proofErr w:type="spellStart"/>
+            <w:r>
+              <w:rPr>
+                <w:rFonts w:eastAsiaTheme="minorHAnsi"/>
+                <w:sz w:val="22"/>
+                <w:szCs w:val="22"/>
+                <w:lang w:val="en-US"/>
+              </w:rPr>
+              <w:t>nhận</w:t>
+            </w:r>
+            <w:proofErr w:type="spellEnd"/>
+            <w:r>
+              <w:rPr>
+                <w:rFonts w:eastAsiaTheme="minorHAnsi"/>
+                <w:sz w:val="22"/>
+                <w:szCs w:val="22"/>
+                <w:lang w:val="en-US"/>
+              </w:rPr>
+              <w:t xml:space="preserve"> (</w:t>
+            </w:r>
+            <w:proofErr w:type="spellStart"/>
+            <w:r>
+              <w:rPr>
+                <w:rFonts w:eastAsiaTheme="minorHAnsi"/>
+                <w:sz w:val="22"/>
+                <w:szCs w:val="22"/>
+                <w:lang w:val="en-US"/>
+              </w:rPr>
+              <w:t>không</w:t>
+            </w:r>
+            <w:proofErr w:type="spellEnd"/>
+            <w:r>
+              <w:rPr>
+                <w:rFonts w:eastAsiaTheme="minorHAnsi"/>
+                <w:sz w:val="22"/>
+                <w:szCs w:val="22"/>
+                <w:lang w:val="en-US"/>
+              </w:rPr>
+              <w:t xml:space="preserve"> </w:t>
+            </w:r>
+            <w:proofErr w:type="spellStart"/>
+            <w:r>
+              <w:rPr>
+                <w:rFonts w:eastAsiaTheme="minorHAnsi"/>
+                <w:sz w:val="22"/>
+                <w:szCs w:val="22"/>
+                <w:lang w:val="en-US"/>
+              </w:rPr>
+              <w:t>ký</w:t>
+            </w:r>
+            <w:proofErr w:type="spellEnd"/>
+            <w:r>
+              <w:rPr>
+                <w:rFonts w:eastAsiaTheme="minorHAnsi"/>
+                <w:sz w:val="22"/>
+                <w:szCs w:val="22"/>
+                <w:lang w:val="en-US"/>
+              </w:rPr>
+              <w:t xml:space="preserve"> </w:t>
+            </w:r>
+            <w:proofErr w:type="spellStart"/>
+            <w:r>
+              <w:rPr>
+                <w:rFonts w:eastAsiaTheme="minorHAnsi"/>
+                <w:sz w:val="22"/>
+                <w:szCs w:val="22"/>
+                <w:lang w:val="en-US"/>
+              </w:rPr>
+              <w:t>trên</w:t>
+            </w:r>
+            <w:proofErr w:type="spellEnd"/>
+            <w:r>
+              <w:rPr>
+                <w:rFonts w:eastAsiaTheme="minorHAnsi"/>
+                <w:sz w:val="22"/>
+                <w:szCs w:val="22"/>
+                <w:lang w:val="en-US"/>
+              </w:rPr>
+              <w:t xml:space="preserve"> </w:t>
+            </w:r>
+            <w:proofErr w:type="spellStart"/>
+            <w:r>
+              <w:rPr>
+                <w:rFonts w:eastAsiaTheme="minorHAnsi"/>
+                <w:sz w:val="22"/>
+                <w:szCs w:val="22"/>
+                <w:lang w:val="en-US"/>
+              </w:rPr>
+              <w:t>giấy</w:t>
+            </w:r>
+            <w:proofErr w:type="spellEnd"/>
+            <w:r>
+              <w:rPr>
+                <w:rFonts w:eastAsiaTheme="minorHAnsi"/>
+                <w:sz w:val="22"/>
+                <w:szCs w:val="22"/>
+                <w:lang w:val="en-US"/>
+              </w:rPr>
+              <w:t xml:space="preserve"> </w:t>
+            </w:r>
+            <w:proofErr w:type="spellStart"/>
+            <w:r>
+              <w:rPr>
+                <w:rFonts w:eastAsiaTheme="minorHAnsi"/>
+                <w:sz w:val="22"/>
+                <w:szCs w:val="22"/>
+                <w:lang w:val="en-US"/>
+              </w:rPr>
+              <w:t>và</w:t>
+            </w:r>
+            <w:proofErr w:type="spellEnd"/>
+            <w:r>
+              <w:rPr>
+                <w:rFonts w:eastAsiaTheme="minorHAnsi"/>
+                <w:sz w:val="22"/>
+                <w:szCs w:val="22"/>
+                <w:lang w:val="en-US"/>
+              </w:rPr>
+              <w:t xml:space="preserve"> </w:t>
+            </w:r>
+            <w:proofErr w:type="spellStart"/>
+            <w:r>
+              <w:rPr>
+                <w:rFonts w:eastAsiaTheme="minorHAnsi"/>
+                <w:sz w:val="22"/>
+                <w:szCs w:val="22"/>
+                <w:lang w:val="en-US"/>
+              </w:rPr>
+              <w:t>không</w:t>
+            </w:r>
+            <w:proofErr w:type="spellEnd"/>
+            <w:r>
+              <w:rPr>
+                <w:rFonts w:eastAsiaTheme="minorHAnsi"/>
+                <w:sz w:val="22"/>
+                <w:szCs w:val="22"/>
+                <w:lang w:val="en-US"/>
+              </w:rPr>
+              <w:t xml:space="preserve"> </w:t>
+            </w:r>
+            <w:proofErr w:type="spellStart"/>
+            <w:r>
+              <w:rPr>
+                <w:rFonts w:eastAsiaTheme="minorHAnsi"/>
+                <w:sz w:val="22"/>
+                <w:szCs w:val="22"/>
+                <w:lang w:val="en-US"/>
+              </w:rPr>
+              <w:t>gửi</w:t>
+            </w:r>
+            <w:proofErr w:type="spellEnd"/>
+            <w:r>
+              <w:rPr>
+                <w:rFonts w:eastAsiaTheme="minorHAnsi"/>
+                <w:sz w:val="22"/>
+                <w:szCs w:val="22"/>
+                <w:lang w:val="en-US"/>
+              </w:rPr>
+              <w:t xml:space="preserve"> </w:t>
+            </w:r>
+            <w:proofErr w:type="spellStart"/>
+            <w:r>
+              <w:rPr>
+                <w:rFonts w:eastAsiaTheme="minorHAnsi"/>
+                <w:sz w:val="22"/>
+                <w:szCs w:val="22"/>
+                <w:lang w:val="en-US"/>
+              </w:rPr>
+              <w:t>bản</w:t>
+            </w:r>
+            <w:proofErr w:type="spellEnd"/>
+            <w:r>
+              <w:rPr>
+                <w:rFonts w:eastAsiaTheme="minorHAnsi"/>
+                <w:sz w:val="22"/>
+                <w:szCs w:val="22"/>
+                <w:lang w:val="en-US"/>
+              </w:rPr>
+              <w:t xml:space="preserve"> </w:t>
+            </w:r>
+            <w:proofErr w:type="spellStart"/>
+            <w:r>
+              <w:rPr>
+                <w:rFonts w:eastAsiaTheme="minorHAnsi"/>
+                <w:sz w:val="22"/>
+                <w:szCs w:val="22"/>
+                <w:lang w:val="en-US"/>
+              </w:rPr>
+              <w:t>giấy</w:t>
+            </w:r>
+            <w:proofErr w:type="spellEnd"/>
+            <w:r>
+              <w:rPr>
+                <w:rFonts w:eastAsiaTheme="minorHAnsi"/>
+                <w:sz w:val="22"/>
+                <w:szCs w:val="22"/>
+                <w:lang w:val="en-US"/>
+              </w:rPr>
+              <w:t xml:space="preserve">). </w:t>
             </w:r>
           </w:p>
         </w:tc>

</xml_diff>